<commit_message>
Labs for Agile and UML added
</commit_message>
<xml_diff>
--- a/Designing Software - Lab 1.docx
+++ b/Designing Software - Lab 1.docx
@@ -9,18 +9,15 @@
       <w:r>
         <w:t>Designing Software</w:t>
       </w:r>
+      <w:r>
+        <w:t xml:space="preserve"> – Lab</w:t>
+      </w:r>
     </w:p>
     <w:p>
       <w:pPr>
         <w:pStyle w:val="Heading1"/>
       </w:pPr>
       <w:r>
-        <w:t xml:space="preserve">Day 1 Lab </w:t>
-      </w:r>
-      <w:r>
-        <w:t xml:space="preserve">- </w:t>
-      </w:r>
-      <w:r>
         <w:t>Agile Food Delivery App</w:t>
       </w:r>
     </w:p>
@@ -35,7 +32,17 @@
     </w:p>
     <w:p>
       <w:r>
-        <w:t>Acme is building a food delivery app similar to Uber Eats.</w:t>
+        <w:t>Your team</w:t>
+      </w:r>
+      <w:r>
+        <w:t xml:space="preserve"> is building a food delivery app similar to Uber Eat</w:t>
+      </w:r>
+      <w:r>
+        <w:t>s.</w:t>
+      </w:r>
+      <w:r>
+        <w:br/>
+        <w:t>Please read the scenario below and think about creating a successful Agile Scrum project.</w:t>
       </w:r>
     </w:p>
     <w:p>
@@ -52,6 +59,7 @@
           <w:ilvl w:val="0"/>
           <w:numId w:val="1"/>
         </w:numPr>
+        <w:spacing w:line="360" w:lineRule="auto"/>
       </w:pPr>
       <w:r>
         <w:t>4 developers per team</w:t>
@@ -63,6 +71,7 @@
           <w:ilvl w:val="0"/>
           <w:numId w:val="1"/>
         </w:numPr>
+        <w:spacing w:line="360" w:lineRule="auto"/>
       </w:pPr>
       <w:r>
         <w:t>3 month MVP deadline</w:t>
@@ -74,6 +83,7 @@
           <w:ilvl w:val="0"/>
           <w:numId w:val="1"/>
         </w:numPr>
+        <w:spacing w:line="360" w:lineRule="auto"/>
       </w:pPr>
       <w:r>
         <w:t>Limited budget</w:t>
@@ -85,12 +95,17 @@
           <w:ilvl w:val="0"/>
           <w:numId w:val="1"/>
         </w:numPr>
+        <w:spacing w:line="360" w:lineRule="auto"/>
       </w:pPr>
       <w:r>
         <w:t>Mobile first</w:t>
       </w:r>
     </w:p>
-    <w:p/>
+    <w:p>
+      <w:pPr>
+        <w:spacing w:line="360" w:lineRule="auto"/>
+      </w:pPr>
+    </w:p>
     <w:p>
       <w:pPr>
         <w:pStyle w:val="Heading2"/>
@@ -100,7 +115,17 @@
       </w:r>
     </w:p>
     <w:p>
-      <w:r>
+      <w:pPr>
+        <w:rPr>
+          <w:b/>
+          <w:bCs/>
+        </w:rPr>
+      </w:pPr>
+      <w:r>
+        <w:rPr>
+          <w:b/>
+          <w:bCs/>
+        </w:rPr>
         <w:t>Assign roles:</w:t>
       </w:r>
     </w:p>
@@ -110,6 +135,7 @@
           <w:ilvl w:val="0"/>
           <w:numId w:val="2"/>
         </w:numPr>
+        <w:spacing w:line="360" w:lineRule="auto"/>
       </w:pPr>
       <w:r>
         <w:t>Product Owner</w:t>
@@ -121,6 +147,7 @@
           <w:ilvl w:val="0"/>
           <w:numId w:val="2"/>
         </w:numPr>
+        <w:spacing w:line="360" w:lineRule="auto"/>
       </w:pPr>
       <w:r>
         <w:t>Scrum Master</w:t>
@@ -132,6 +159,7 @@
           <w:ilvl w:val="0"/>
           <w:numId w:val="2"/>
         </w:numPr>
+        <w:spacing w:line="360" w:lineRule="auto"/>
       </w:pPr>
       <w:r>
         <w:t>Developers</w:t>
@@ -141,14 +169,18 @@
       </w:r>
     </w:p>
     <w:p>
-      <w:r>
+      <w:pPr>
         <w:rPr>
-          <w:rFonts w:ascii="Segoe UI Emoji" w:hAnsi="Segoe UI Emoji" w:cs="Segoe UI Emoji"/>
+          <w:b/>
+          <w:bCs/>
         </w:rPr>
-        <w:t>👉</w:t>
-      </w:r>
-      <w:r>
-        <w:t xml:space="preserve"> Everyone contributes, but:</w:t>
+      </w:pPr>
+      <w:r>
+        <w:rPr>
+          <w:b/>
+          <w:bCs/>
+        </w:rPr>
+        <w:t>Everyone contributes, but:</w:t>
       </w:r>
     </w:p>
     <w:p>
@@ -184,30 +216,19 @@
     </w:p>
     <w:tbl>
       <w:tblPr>
+        <w:tblStyle w:val="TableGridLight"/>
         <w:tblW w:w="0" w:type="auto"/>
-        <w:tblCellSpacing w:w="15" w:type="dxa"/>
-        <w:tblCellMar>
-          <w:top w:w="15" w:type="dxa"/>
-          <w:left w:w="15" w:type="dxa"/>
-          <w:bottom w:w="15" w:type="dxa"/>
-          <w:right w:w="15" w:type="dxa"/>
-        </w:tblCellMar>
         <w:tblLook w:val="04A0" w:firstRow="1" w:lastRow="0" w:firstColumn="1" w:lastColumn="0" w:noHBand="0" w:noVBand="1"/>
       </w:tblPr>
       <w:tblGrid>
-        <w:gridCol w:w="749"/>
-        <w:gridCol w:w="2115"/>
-        <w:gridCol w:w="776"/>
+        <w:gridCol w:w="890"/>
+        <w:gridCol w:w="2271"/>
+        <w:gridCol w:w="917"/>
       </w:tblGrid>
       <w:tr>
-        <w:trPr>
-          <w:tblHeader/>
-          <w:tblCellSpacing w:w="15" w:type="dxa"/>
-        </w:trPr>
         <w:tc>
           <w:tcPr>
             <w:tcW w:w="0" w:type="auto"/>
-            <w:vAlign w:val="center"/>
             <w:hideMark/>
           </w:tcPr>
           <w:p>
@@ -229,7 +250,6 @@
         <w:tc>
           <w:tcPr>
             <w:tcW w:w="0" w:type="auto"/>
-            <w:vAlign w:val="center"/>
             <w:hideMark/>
           </w:tcPr>
           <w:p>
@@ -251,7 +271,6 @@
         <w:tc>
           <w:tcPr>
             <w:tcW w:w="0" w:type="auto"/>
-            <w:vAlign w:val="center"/>
             <w:hideMark/>
           </w:tcPr>
           <w:p>
@@ -272,13 +291,9 @@
         </w:tc>
       </w:tr>
       <w:tr>
-        <w:trPr>
-          <w:tblCellSpacing w:w="15" w:type="dxa"/>
-        </w:trPr>
         <w:tc>
           <w:tcPr>
             <w:tcW w:w="0" w:type="auto"/>
-            <w:vAlign w:val="center"/>
             <w:hideMark/>
           </w:tcPr>
           <w:p>
@@ -290,7 +305,6 @@
         <w:tc>
           <w:tcPr>
             <w:tcW w:w="0" w:type="auto"/>
-            <w:vAlign w:val="center"/>
             <w:hideMark/>
           </w:tcPr>
           <w:p>
@@ -302,7 +316,6 @@
         <w:tc>
           <w:tcPr>
             <w:tcW w:w="0" w:type="auto"/>
-            <w:vAlign w:val="center"/>
             <w:hideMark/>
           </w:tcPr>
           <w:p>
@@ -313,13 +326,9 @@
         </w:tc>
       </w:tr>
       <w:tr>
-        <w:trPr>
-          <w:tblCellSpacing w:w="15" w:type="dxa"/>
-        </w:trPr>
         <w:tc>
           <w:tcPr>
             <w:tcW w:w="0" w:type="auto"/>
-            <w:vAlign w:val="center"/>
             <w:hideMark/>
           </w:tcPr>
           <w:p>
@@ -331,7 +340,6 @@
         <w:tc>
           <w:tcPr>
             <w:tcW w:w="0" w:type="auto"/>
-            <w:vAlign w:val="center"/>
             <w:hideMark/>
           </w:tcPr>
           <w:p>
@@ -343,7 +351,6 @@
         <w:tc>
           <w:tcPr>
             <w:tcW w:w="0" w:type="auto"/>
-            <w:vAlign w:val="center"/>
             <w:hideMark/>
           </w:tcPr>
           <w:p>
@@ -354,13 +361,9 @@
         </w:tc>
       </w:tr>
       <w:tr>
-        <w:trPr>
-          <w:tblCellSpacing w:w="15" w:type="dxa"/>
-        </w:trPr>
         <w:tc>
           <w:tcPr>
             <w:tcW w:w="0" w:type="auto"/>
-            <w:vAlign w:val="center"/>
             <w:hideMark/>
           </w:tcPr>
           <w:p>
@@ -372,7 +375,6 @@
         <w:tc>
           <w:tcPr>
             <w:tcW w:w="0" w:type="auto"/>
-            <w:vAlign w:val="center"/>
             <w:hideMark/>
           </w:tcPr>
           <w:p>
@@ -384,7 +386,6 @@
         <w:tc>
           <w:tcPr>
             <w:tcW w:w="0" w:type="auto"/>
-            <w:vAlign w:val="center"/>
             <w:hideMark/>
           </w:tcPr>
           <w:p>
@@ -395,13 +396,9 @@
         </w:tc>
       </w:tr>
       <w:tr>
-        <w:trPr>
-          <w:tblCellSpacing w:w="15" w:type="dxa"/>
-        </w:trPr>
         <w:tc>
           <w:tcPr>
             <w:tcW w:w="0" w:type="auto"/>
-            <w:vAlign w:val="center"/>
             <w:hideMark/>
           </w:tcPr>
           <w:p>
@@ -413,7 +410,6 @@
         <w:tc>
           <w:tcPr>
             <w:tcW w:w="0" w:type="auto"/>
-            <w:vAlign w:val="center"/>
             <w:hideMark/>
           </w:tcPr>
           <w:p>
@@ -425,7 +421,6 @@
         <w:tc>
           <w:tcPr>
             <w:tcW w:w="0" w:type="auto"/>
-            <w:vAlign w:val="center"/>
             <w:hideMark/>
           </w:tcPr>
           <w:p>
@@ -436,13 +431,9 @@
         </w:tc>
       </w:tr>
       <w:tr>
-        <w:trPr>
-          <w:tblCellSpacing w:w="15" w:type="dxa"/>
-        </w:trPr>
         <w:tc>
           <w:tcPr>
             <w:tcW w:w="0" w:type="auto"/>
-            <w:vAlign w:val="center"/>
             <w:hideMark/>
           </w:tcPr>
           <w:p>
@@ -454,7 +445,6 @@
         <w:tc>
           <w:tcPr>
             <w:tcW w:w="0" w:type="auto"/>
-            <w:vAlign w:val="center"/>
             <w:hideMark/>
           </w:tcPr>
           <w:p>
@@ -466,7 +456,6 @@
         <w:tc>
           <w:tcPr>
             <w:tcW w:w="0" w:type="auto"/>
-            <w:vAlign w:val="center"/>
             <w:hideMark/>
           </w:tcPr>
           <w:p>
@@ -477,13 +466,9 @@
         </w:tc>
       </w:tr>
       <w:tr>
-        <w:trPr>
-          <w:tblCellSpacing w:w="15" w:type="dxa"/>
-        </w:trPr>
         <w:tc>
           <w:tcPr>
             <w:tcW w:w="0" w:type="auto"/>
-            <w:vAlign w:val="center"/>
             <w:hideMark/>
           </w:tcPr>
           <w:p>
@@ -495,7 +480,6 @@
         <w:tc>
           <w:tcPr>
             <w:tcW w:w="0" w:type="auto"/>
-            <w:vAlign w:val="center"/>
             <w:hideMark/>
           </w:tcPr>
           <w:p>
@@ -507,7 +491,6 @@
         <w:tc>
           <w:tcPr>
             <w:tcW w:w="0" w:type="auto"/>
-            <w:vAlign w:val="center"/>
             <w:hideMark/>
           </w:tcPr>
           <w:p>
@@ -529,311 +512,906 @@
     </w:p>
     <w:p>
       <w:pPr>
+        <w:pStyle w:val="Heading3"/>
+      </w:pPr>
+      <w:r>
+        <w:t>Objective</w:t>
+      </w:r>
+    </w:p>
+    <w:p>
+      <w:r>
+        <w:t>Understand how your team will run the project using Agile.</w:t>
+      </w:r>
+    </w:p>
+    <w:p>
+      <w:pPr>
         <w:rPr>
           <w:b/>
           <w:bCs/>
         </w:rPr>
       </w:pPr>
-      <w:r>
+    </w:p>
+    <w:p>
+      <w:pPr>
+        <w:pStyle w:val="Heading2"/>
+      </w:pPr>
+      <w:r>
+        <w:t xml:space="preserve">Tasks: </w:t>
+      </w:r>
+      <w:r>
+        <w:t>1. Why Agile?</w:t>
+      </w:r>
+    </w:p>
+    <w:p>
+      <w:pPr>
+        <w:pStyle w:val="Heading3"/>
+      </w:pPr>
+      <w:r>
+        <w:t>Discuss and write:</w:t>
+      </w:r>
+    </w:p>
+    <w:p>
+      <w:pPr>
+        <w:keepNext/>
+        <w:keepLines/>
+        <w:numPr>
+          <w:ilvl w:val="0"/>
+          <w:numId w:val="4"/>
+        </w:numPr>
+        <w:spacing w:line="360" w:lineRule="auto"/>
+      </w:pPr>
+      <w:r>
+        <w:t>Why Agile suits this project</w:t>
+      </w:r>
+    </w:p>
+    <w:p>
+      <w:pPr>
+        <w:keepNext/>
+        <w:keepLines/>
+        <w:numPr>
+          <w:ilvl w:val="0"/>
+          <w:numId w:val="4"/>
+        </w:numPr>
+        <w:spacing w:line="360" w:lineRule="auto"/>
+      </w:pPr>
+      <w:r>
+        <w:t>What problems it solves</w:t>
+      </w:r>
+      <w:r>
+        <w:br/>
+      </w:r>
+    </w:p>
+    <w:p>
+      <w:r>
+        <w:rPr>
+          <w:rFonts w:ascii="Segoe UI Emoji" w:hAnsi="Segoe UI Emoji" w:cs="Segoe UI Emoji"/>
+        </w:rPr>
+        <w:t>👉</w:t>
+      </w:r>
+      <w:r>
+        <w:t xml:space="preserve"> Prompt:</w:t>
+      </w:r>
+    </w:p>
+    <w:p>
+      <w:pPr>
+        <w:numPr>
+          <w:ilvl w:val="0"/>
+          <w:numId w:val="5"/>
+        </w:numPr>
+        <w:spacing w:line="360" w:lineRule="auto"/>
+      </w:pPr>
+      <w:r>
+        <w:t>Requirements changing?</w:t>
+      </w:r>
+    </w:p>
+    <w:p>
+      <w:pPr>
+        <w:numPr>
+          <w:ilvl w:val="0"/>
+          <w:numId w:val="5"/>
+        </w:numPr>
+        <w:spacing w:line="360" w:lineRule="auto"/>
+      </w:pPr>
+      <w:r>
+        <w:t>Need fast delivery?</w:t>
+      </w:r>
+    </w:p>
+    <w:p>
+      <w:pPr>
+        <w:numPr>
+          <w:ilvl w:val="0"/>
+          <w:numId w:val="5"/>
+        </w:numPr>
+        <w:spacing w:line="360" w:lineRule="auto"/>
+      </w:pPr>
+      <w:r>
+        <w:t>Limited budget?</w:t>
+      </w:r>
+    </w:p>
+    <w:p/>
+    <w:p>
+      <w:pPr>
+        <w:pStyle w:val="Heading2"/>
+      </w:pPr>
+      <w:r>
+        <w:t>2. Define key Agile concepts</w:t>
+      </w:r>
+    </w:p>
+    <w:p>
+      <w:pPr>
+        <w:pStyle w:val="Heading3"/>
+      </w:pPr>
+      <w:r>
+        <w:t>Write short definitions (1–2 lines each):</w:t>
+      </w:r>
+    </w:p>
+    <w:p>
+      <w:pPr>
+        <w:numPr>
+          <w:ilvl w:val="0"/>
+          <w:numId w:val="6"/>
+        </w:numPr>
+        <w:spacing w:line="360" w:lineRule="auto"/>
+      </w:pPr>
+      <w:r>
+        <w:t>Sprint</w:t>
+      </w:r>
+    </w:p>
+    <w:p>
+      <w:pPr>
+        <w:numPr>
+          <w:ilvl w:val="0"/>
+          <w:numId w:val="6"/>
+        </w:numPr>
+        <w:spacing w:line="360" w:lineRule="auto"/>
+      </w:pPr>
+      <w:r>
+        <w:t>Backlog</w:t>
+      </w:r>
+    </w:p>
+    <w:p>
+      <w:pPr>
+        <w:numPr>
+          <w:ilvl w:val="0"/>
+          <w:numId w:val="6"/>
+        </w:numPr>
+        <w:spacing w:line="360" w:lineRule="auto"/>
+      </w:pPr>
+      <w:r>
+        <w:t>User story</w:t>
+      </w:r>
+    </w:p>
+    <w:p>
+      <w:pPr>
+        <w:numPr>
+          <w:ilvl w:val="0"/>
+          <w:numId w:val="6"/>
+        </w:numPr>
+        <w:spacing w:line="360" w:lineRule="auto"/>
+      </w:pPr>
+      <w:r>
+        <w:t>Increment</w:t>
+      </w:r>
+    </w:p>
+    <w:p>
+      <w:pPr>
+        <w:numPr>
+          <w:ilvl w:val="0"/>
+          <w:numId w:val="6"/>
+        </w:numPr>
+        <w:spacing w:line="360" w:lineRule="auto"/>
+      </w:pPr>
+      <w:r>
+        <w:t>Definition of Done</w:t>
+      </w:r>
+    </w:p>
+    <w:p/>
+    <w:p>
+      <w:pPr>
+        <w:pStyle w:val="Heading2"/>
+      </w:pPr>
+      <w:r>
+        <w:t>3. Decide how your team will work</w:t>
+      </w:r>
+    </w:p>
+    <w:p>
+      <w:pPr>
+        <w:pStyle w:val="Heading3"/>
+      </w:pPr>
+      <w:r>
+        <w:t>Define:</w:t>
+      </w:r>
+    </w:p>
+    <w:p>
+      <w:pPr>
+        <w:numPr>
+          <w:ilvl w:val="0"/>
+          <w:numId w:val="7"/>
+        </w:numPr>
+        <w:spacing w:line="360" w:lineRule="auto"/>
+      </w:pPr>
+      <w:r>
+        <w:t>Sprint length (1 or 2 weeks)</w:t>
+      </w:r>
+    </w:p>
+    <w:p>
+      <w:pPr>
+        <w:numPr>
+          <w:ilvl w:val="0"/>
+          <w:numId w:val="7"/>
+        </w:numPr>
+        <w:spacing w:line="360" w:lineRule="auto"/>
+      </w:pPr>
+      <w:r>
+        <w:t>Number of sprints in 3 months</w:t>
+      </w:r>
+    </w:p>
+    <w:p>
+      <w:pPr>
+        <w:numPr>
+          <w:ilvl w:val="0"/>
+          <w:numId w:val="7"/>
+        </w:numPr>
+        <w:spacing w:line="360" w:lineRule="auto"/>
+      </w:pPr>
+      <w:r>
+        <w:t>What “Done” means</w:t>
+      </w:r>
+      <w:r>
+        <w:br/>
+      </w:r>
+    </w:p>
+    <w:p>
+      <w:r>
+        <w:rPr>
+          <w:rFonts w:ascii="Segoe UI Emoji" w:hAnsi="Segoe UI Emoji" w:cs="Segoe UI Emoji"/>
+        </w:rPr>
+        <w:t>👉</w:t>
+      </w:r>
+      <w:r>
+        <w:t xml:space="preserve"> Example Definition of Done:</w:t>
+      </w:r>
+    </w:p>
+    <w:p>
+      <w:pPr>
+        <w:numPr>
+          <w:ilvl w:val="0"/>
+          <w:numId w:val="8"/>
+        </w:numPr>
+        <w:spacing w:line="360" w:lineRule="auto"/>
+      </w:pPr>
+      <w:r>
+        <w:t>Feature works</w:t>
+      </w:r>
+    </w:p>
+    <w:p>
+      <w:pPr>
+        <w:numPr>
+          <w:ilvl w:val="0"/>
+          <w:numId w:val="8"/>
+        </w:numPr>
+        <w:spacing w:line="360" w:lineRule="auto"/>
+      </w:pPr>
+      <w:r>
+        <w:t>Meets acceptance criteria</w:t>
+      </w:r>
+    </w:p>
+    <w:p>
+      <w:pPr>
+        <w:numPr>
+          <w:ilvl w:val="0"/>
+          <w:numId w:val="8"/>
+        </w:numPr>
+        <w:spacing w:line="360" w:lineRule="auto"/>
+      </w:pPr>
+      <w:r>
+        <w:t>Tested</w:t>
+      </w:r>
+    </w:p>
+    <w:p/>
+    <w:p>
+      <w:pPr>
+        <w:pStyle w:val="Heading2"/>
+      </w:pPr>
+      <w:r>
+        <w:t>Output</w:t>
+      </w:r>
+    </w:p>
+    <w:p>
+      <w:pPr>
+        <w:numPr>
+          <w:ilvl w:val="0"/>
+          <w:numId w:val="9"/>
+        </w:numPr>
+        <w:spacing w:line="360" w:lineRule="auto"/>
+      </w:pPr>
+      <w:r>
+        <w:t xml:space="preserve">Short summary </w:t>
+      </w:r>
+    </w:p>
+    <w:p>
+      <w:pPr>
+        <w:numPr>
+          <w:ilvl w:val="0"/>
+          <w:numId w:val="9"/>
+        </w:numPr>
+        <w:spacing w:line="360" w:lineRule="auto"/>
+      </w:pPr>
+      <w:r>
+        <w:t>Bullet list of decisions</w:t>
+      </w:r>
+    </w:p>
+    <w:p>
+      <w:pPr>
+        <w:pStyle w:val="Heading1"/>
+      </w:pPr>
+      <w:r>
+        <w:lastRenderedPageBreak/>
+        <w:t>Food Delivery System – Scenario Brief</w:t>
+      </w:r>
+    </w:p>
+    <w:p>
+      <w:pPr>
         <w:rPr>
           <w:b/>
           <w:bCs/>
         </w:rPr>
-        <w:t>Objective</w:t>
-      </w:r>
-    </w:p>
-    <w:p>
-      <w:r>
-        <w:t>Understand how your team will run the project using Agile.</w:t>
-      </w:r>
-    </w:p>
-    <w:p>
-      <w:pPr>
+      </w:pPr>
+    </w:p>
+    <w:p>
+      <w:pPr>
+        <w:pStyle w:val="Heading3"/>
+      </w:pPr>
+      <w:r>
+        <w:t>Background</w:t>
+      </w:r>
+    </w:p>
+    <w:p>
+      <w:r>
+        <w:t xml:space="preserve">You have decided to create a </w:t>
+      </w:r>
+      <w:r>
+        <w:t xml:space="preserve">startup company called </w:t>
+      </w:r>
+      <w:r>
         <w:rPr>
           <w:b/>
           <w:bCs/>
         </w:rPr>
-      </w:pPr>
-    </w:p>
-    <w:p>
-      <w:pPr>
-        <w:pStyle w:val="Heading2"/>
-      </w:pPr>
-      <w:r>
-        <w:t xml:space="preserve">Tasks: </w:t>
-      </w:r>
-      <w:r>
-        <w:t>1. Why Agile?</w:t>
-      </w:r>
-    </w:p>
-    <w:p>
-      <w:r>
-        <w:t>Discuss and write:</w:t>
+        <w:t>QuickBite</w:t>
+      </w:r>
+      <w:r>
+        <w:t xml:space="preserve"> </w:t>
+      </w:r>
+      <w:r>
+        <w:t xml:space="preserve">(Or choose another name) </w:t>
+      </w:r>
+      <w:r>
+        <w:t>is planning to launch a new food delivery platform to compete with services like Uber Eats and Deliveroo.</w:t>
+      </w:r>
+    </w:p>
+    <w:p>
+      <w:r>
+        <w:t>The goal is to create a system that connects customers, restaurants, and delivery drivers through a single platform that manages ordering, preparation, and delivery of food.</w:t>
+      </w:r>
+    </w:p>
+    <w:p>
+      <w:r>
+        <w:t>The founders have come to your development team with a rough idea of how the system should work, but no formal specification exists yet.</w:t>
+      </w:r>
+    </w:p>
+    <w:p>
+      <w:r>
+        <w:t>Your task is to analyse the scenario and design the system from scratch.</w:t>
+      </w:r>
+    </w:p>
+    <w:p/>
+    <w:p>
+      <w:pPr>
+        <w:pStyle w:val="Heading3"/>
+      </w:pPr>
+      <w:r>
+        <w:t>Scenario Description</w:t>
+      </w:r>
+    </w:p>
+    <w:p>
+      <w:r>
+        <w:rPr>
+          <w:b/>
+          <w:bCs/>
+        </w:rPr>
+        <w:t>QuickBite</w:t>
+      </w:r>
+      <w:r>
+        <w:t xml:space="preserve"> allows customers to browse nearby restaurants, view menus, and place orders for delivery.</w:t>
+      </w:r>
+    </w:p>
+    <w:p/>
+    <w:p>
+      <w:pPr>
+        <w:rPr>
+          <w:b/>
+          <w:bCs/>
+        </w:rPr>
+      </w:pPr>
+      <w:r>
+        <w:rPr>
+          <w:b/>
+          <w:bCs/>
+        </w:rPr>
+        <w:t>When a customer places an order:</w:t>
       </w:r>
     </w:p>
     <w:p>
       <w:pPr>
         <w:numPr>
           <w:ilvl w:val="0"/>
-          <w:numId w:val="4"/>
+          <w:numId w:val="33"/>
         </w:numPr>
-      </w:pPr>
-      <w:r>
-        <w:t>Why Agile suits this project</w:t>
+        <w:spacing w:line="276" w:lineRule="auto"/>
+      </w:pPr>
+      <w:r>
+        <w:t>The selected restaurant receives the order and decides whether to accept or reject it</w:t>
       </w:r>
     </w:p>
     <w:p>
       <w:pPr>
         <w:numPr>
           <w:ilvl w:val="0"/>
-          <w:numId w:val="4"/>
+          <w:numId w:val="33"/>
         </w:numPr>
-      </w:pPr>
-      <w:r>
-        <w:t>What problems it solves</w:t>
-      </w:r>
-      <w:r>
-        <w:br/>
-      </w:r>
-    </w:p>
-    <w:p>
-      <w:r>
-        <w:rPr>
-          <w:rFonts w:ascii="Segoe UI Emoji" w:hAnsi="Segoe UI Emoji" w:cs="Segoe UI Emoji"/>
-        </w:rPr>
-        <w:t>👉</w:t>
-      </w:r>
-      <w:r>
-        <w:t xml:space="preserve"> Prompt:</w:t>
+        <w:spacing w:line="276" w:lineRule="auto"/>
+      </w:pPr>
+      <w:r>
+        <w:t>If accepted, the restaurant prepares the food</w:t>
       </w:r>
     </w:p>
     <w:p>
       <w:pPr>
         <w:numPr>
           <w:ilvl w:val="0"/>
-          <w:numId w:val="5"/>
+          <w:numId w:val="33"/>
         </w:numPr>
-      </w:pPr>
-      <w:r>
-        <w:t>Requirements changing?</w:t>
+        <w:spacing w:line="276" w:lineRule="auto"/>
+      </w:pPr>
+      <w:r>
+        <w:t>Once ready, a delivery driver is assigned to collect and deliver the order</w:t>
+      </w:r>
+    </w:p>
+    <w:p>
+      <w:pPr>
+        <w:rPr>
+          <w:b/>
+          <w:bCs/>
+        </w:rPr>
+      </w:pPr>
+    </w:p>
+    <w:p>
+      <w:pPr>
+        <w:rPr>
+          <w:b/>
+          <w:bCs/>
+        </w:rPr>
+      </w:pPr>
+      <w:r>
+        <w:rPr>
+          <w:b/>
+          <w:bCs/>
+        </w:rPr>
+        <w:t>Customers want to:</w:t>
       </w:r>
     </w:p>
     <w:p>
       <w:pPr>
         <w:numPr>
           <w:ilvl w:val="0"/>
-          <w:numId w:val="5"/>
+          <w:numId w:val="34"/>
         </w:numPr>
-      </w:pPr>
-      <w:r>
-        <w:t>Need fast delivery?</w:t>
+        <w:spacing w:line="276" w:lineRule="auto"/>
+      </w:pPr>
+      <w:r>
+        <w:t>Track their order status in real time</w:t>
       </w:r>
     </w:p>
     <w:p>
       <w:pPr>
         <w:numPr>
           <w:ilvl w:val="0"/>
-          <w:numId w:val="5"/>
+          <w:numId w:val="34"/>
         </w:numPr>
-      </w:pPr>
-      <w:r>
-        <w:t>Limited budget?</w:t>
-      </w:r>
-    </w:p>
-    <w:p/>
-    <w:p>
-      <w:pPr>
-        <w:pStyle w:val="Heading2"/>
-      </w:pPr>
-      <w:r>
-        <w:t>2. Define key Agile concepts</w:t>
-      </w:r>
-    </w:p>
-    <w:p>
-      <w:r>
-        <w:t>Write short definitions (1–2 lines each):</w:t>
+        <w:spacing w:line="276" w:lineRule="auto"/>
+      </w:pPr>
+      <w:r>
+        <w:t>See estimated delivery times</w:t>
       </w:r>
     </w:p>
     <w:p>
       <w:pPr>
         <w:numPr>
           <w:ilvl w:val="0"/>
-          <w:numId w:val="6"/>
+          <w:numId w:val="34"/>
         </w:numPr>
-      </w:pPr>
-      <w:r>
-        <w:t>Sprint</w:t>
+        <w:spacing w:line="276" w:lineRule="auto"/>
+      </w:pPr>
+      <w:r>
+        <w:t>Rate their experience after delivery</w:t>
+      </w:r>
+    </w:p>
+    <w:p/>
+    <w:p>
+      <w:pPr>
+        <w:rPr>
+          <w:b/>
+          <w:bCs/>
+        </w:rPr>
+      </w:pPr>
+      <w:r>
+        <w:rPr>
+          <w:b/>
+          <w:bCs/>
+        </w:rPr>
+        <w:t>Restaurants want to:</w:t>
       </w:r>
     </w:p>
     <w:p>
       <w:pPr>
         <w:numPr>
           <w:ilvl w:val="0"/>
-          <w:numId w:val="6"/>
+          <w:numId w:val="35"/>
         </w:numPr>
-      </w:pPr>
-      <w:r>
-        <w:t>Backlog</w:t>
+        <w:spacing w:line="276" w:lineRule="auto"/>
+      </w:pPr>
+      <w:r>
+        <w:t>Manage their menus and update item availability</w:t>
       </w:r>
     </w:p>
     <w:p>
       <w:pPr>
         <w:numPr>
           <w:ilvl w:val="0"/>
-          <w:numId w:val="6"/>
+          <w:numId w:val="35"/>
         </w:numPr>
-      </w:pPr>
-      <w:r>
-        <w:t>User story</w:t>
+        <w:spacing w:line="276" w:lineRule="auto"/>
+      </w:pPr>
+      <w:r>
+        <w:t>Control whether they are open or closed</w:t>
       </w:r>
     </w:p>
     <w:p>
       <w:pPr>
         <w:numPr>
           <w:ilvl w:val="0"/>
-          <w:numId w:val="6"/>
+          <w:numId w:val="35"/>
         </w:numPr>
-      </w:pPr>
-      <w:r>
-        <w:t>Increment</w:t>
+        <w:spacing w:line="276" w:lineRule="auto"/>
+      </w:pPr>
+      <w:r>
+        <w:t>Handle incoming orders efficiently</w:t>
+      </w:r>
+    </w:p>
+    <w:p>
+      <w:pPr>
+        <w:spacing w:line="276" w:lineRule="auto"/>
+      </w:pPr>
+    </w:p>
+    <w:p>
+      <w:pPr>
+        <w:rPr>
+          <w:b/>
+          <w:bCs/>
+        </w:rPr>
+      </w:pPr>
+      <w:r>
+        <w:rPr>
+          <w:b/>
+          <w:bCs/>
+        </w:rPr>
+        <w:t>Delivery drivers want to:</w:t>
       </w:r>
     </w:p>
     <w:p>
       <w:pPr>
         <w:numPr>
           <w:ilvl w:val="0"/>
-          <w:numId w:val="6"/>
+          <w:numId w:val="36"/>
         </w:numPr>
-      </w:pPr>
-      <w:r>
-        <w:t>Definition of Done</w:t>
-      </w:r>
-    </w:p>
-    <w:p/>
-    <w:p>
-      <w:pPr>
-        <w:pStyle w:val="Heading2"/>
-      </w:pPr>
-      <w:r>
-        <w:t>3. Decide how your team will work</w:t>
-      </w:r>
-    </w:p>
-    <w:p>
-      <w:r>
-        <w:t>Define:</w:t>
+        <w:spacing w:line="276" w:lineRule="auto"/>
+      </w:pPr>
+      <w:r>
+        <w:t>Choose when they are available to work</w:t>
       </w:r>
     </w:p>
     <w:p>
       <w:pPr>
         <w:numPr>
           <w:ilvl w:val="0"/>
-          <w:numId w:val="7"/>
+          <w:numId w:val="36"/>
         </w:numPr>
-      </w:pPr>
-      <w:r>
-        <w:t>Sprint length (1 or 2 weeks)</w:t>
+        <w:spacing w:line="276" w:lineRule="auto"/>
+      </w:pPr>
+      <w:r>
+        <w:t>Accept or decline delivery requests</w:t>
       </w:r>
     </w:p>
     <w:p>
       <w:pPr>
         <w:numPr>
           <w:ilvl w:val="0"/>
-          <w:numId w:val="7"/>
+          <w:numId w:val="36"/>
         </w:numPr>
-      </w:pPr>
-      <w:r>
-        <w:t>Number of sprints in 3 months</w:t>
+        <w:spacing w:line="276" w:lineRule="auto"/>
+      </w:pPr>
+      <w:r>
+        <w:t>Navigate to restaurants and customers</w:t>
       </w:r>
     </w:p>
     <w:p>
       <w:pPr>
         <w:numPr>
           <w:ilvl w:val="0"/>
-          <w:numId w:val="7"/>
+          <w:numId w:val="36"/>
         </w:numPr>
-      </w:pPr>
-      <w:r>
-        <w:t>What “Done” means</w:t>
+        <w:spacing w:line="276" w:lineRule="auto"/>
+      </w:pPr>
+      <w:r>
+        <w:t>Update delivery status throughout the process</w:t>
+      </w:r>
+    </w:p>
+    <w:p>
+      <w:pPr>
+        <w:spacing w:line="276" w:lineRule="auto"/>
+      </w:pPr>
+    </w:p>
+    <w:p>
+      <w:r>
+        <w:t>The company also requires an administrative function to monitor the platform, manage users, and review system activity.</w:t>
+      </w:r>
+    </w:p>
+    <w:p/>
+    <w:p>
+      <w:pPr>
+        <w:pStyle w:val="Heading2"/>
+      </w:pPr>
+      <w:r>
+        <w:lastRenderedPageBreak/>
+        <w:t>Your Task</w:t>
+      </w:r>
+    </w:p>
+    <w:p>
+      <w:pPr>
+        <w:keepNext/>
+        <w:keepLines/>
+      </w:pPr>
+      <w:r>
+        <w:t>You are required to analyse the scenario and produce a system design. You have not been given a predefined structure, so you must determine the key components yourself.</w:t>
       </w:r>
       <w:r>
         <w:br/>
       </w:r>
     </w:p>
     <w:p>
-      <w:r>
+      <w:pPr>
+        <w:keepNext/>
+        <w:keepLines/>
+        <w:spacing w:line="360" w:lineRule="auto"/>
         <w:rPr>
-          <w:rFonts w:ascii="Segoe UI Emoji" w:hAnsi="Segoe UI Emoji" w:cs="Segoe UI Emoji"/>
+          <w:b/>
+          <w:bCs/>
         </w:rPr>
-        <w:t>👉</w:t>
-      </w:r>
-      <w:r>
-        <w:t xml:space="preserve"> Example Definition of Done:</w:t>
-      </w:r>
-    </w:p>
-    <w:p>
-      <w:pPr>
+      </w:pPr>
+      <w:r>
+        <w:rPr>
+          <w:b/>
+          <w:bCs/>
+        </w:rPr>
+        <w:t>As part of your analysis, you should identify:</w:t>
+      </w:r>
+    </w:p>
+    <w:p>
+      <w:pPr>
+        <w:keepNext/>
+        <w:keepLines/>
         <w:numPr>
           <w:ilvl w:val="0"/>
-          <w:numId w:val="8"/>
+          <w:numId w:val="37"/>
         </w:numPr>
-      </w:pPr>
-      <w:r>
-        <w:t>Feature works</w:t>
-      </w:r>
-    </w:p>
-    <w:p>
-      <w:pPr>
+        <w:spacing w:line="360" w:lineRule="auto"/>
+      </w:pPr>
+      <w:r>
+        <w:t>The different types of users (actors) interacting with the system</w:t>
+      </w:r>
+    </w:p>
+    <w:p>
+      <w:pPr>
+        <w:keepNext/>
+        <w:keepLines/>
         <w:numPr>
           <w:ilvl w:val="0"/>
-          <w:numId w:val="8"/>
+          <w:numId w:val="37"/>
         </w:numPr>
-      </w:pPr>
-      <w:r>
-        <w:t>Meets acceptance criteria</w:t>
-      </w:r>
-    </w:p>
-    <w:p>
-      <w:pPr>
+        <w:spacing w:line="360" w:lineRule="auto"/>
+      </w:pPr>
+      <w:r>
+        <w:t>The main use cases that describe how the system will be used</w:t>
+      </w:r>
+    </w:p>
+    <w:p>
+      <w:pPr>
+        <w:keepNext/>
+        <w:keepLines/>
         <w:numPr>
           <w:ilvl w:val="0"/>
-          <w:numId w:val="8"/>
+          <w:numId w:val="37"/>
         </w:numPr>
-      </w:pPr>
-      <w:r>
-        <w:t>Tested</w:t>
-      </w:r>
-    </w:p>
-    <w:p/>
-    <w:p>
-      <w:pPr>
-        <w:pStyle w:val="Heading2"/>
-      </w:pPr>
-      <w:r>
-        <w:t>Output</w:t>
-      </w:r>
-    </w:p>
-    <w:p>
-      <w:pPr>
+        <w:spacing w:line="360" w:lineRule="auto"/>
+      </w:pPr>
+      <w:r>
+        <w:t>The key entities required to store and manage data</w:t>
+      </w:r>
+    </w:p>
+    <w:p>
+      <w:pPr>
+        <w:keepNext/>
+        <w:keepLines/>
         <w:numPr>
           <w:ilvl w:val="0"/>
-          <w:numId w:val="9"/>
+          <w:numId w:val="37"/>
         </w:numPr>
-      </w:pPr>
-      <w:r>
-        <w:t>Short summary (150–200 words)</w:t>
+        <w:spacing w:line="360" w:lineRule="auto"/>
+      </w:pPr>
+      <w:r>
+        <w:t>The relationships between those entities</w:t>
+      </w:r>
+      <w:r>
+        <w:br/>
+      </w:r>
+    </w:p>
+    <w:p>
+      <w:pPr>
+        <w:keepNext/>
+        <w:keepLines/>
+      </w:pPr>
+      <w:r>
+        <w:t>You should present your work using appropriate diagrams and supporting explanations where necessary.</w:t>
+      </w:r>
+    </w:p>
+    <w:p/>
+    <w:p>
+      <w:pPr>
+        <w:pStyle w:val="Heading2"/>
+      </w:pPr>
+      <w:r>
+        <w:t>Expected Outputs</w:t>
+      </w:r>
+    </w:p>
+    <w:p>
+      <w:pPr>
+        <w:rPr>
+          <w:b/>
+          <w:bCs/>
+        </w:rPr>
+      </w:pPr>
+      <w:r>
+        <w:rPr>
+          <w:b/>
+          <w:bCs/>
+        </w:rPr>
+        <w:t>You should produce:</w:t>
       </w:r>
     </w:p>
     <w:p>
       <w:pPr>
         <w:numPr>
           <w:ilvl w:val="0"/>
-          <w:numId w:val="9"/>
+          <w:numId w:val="38"/>
         </w:numPr>
-      </w:pPr>
-      <w:r>
-        <w:t>Bullet list of decisions</w:t>
-      </w:r>
-    </w:p>
+        <w:spacing w:line="360" w:lineRule="auto"/>
+      </w:pPr>
+      <w:r>
+        <w:t>A list of identified actors</w:t>
+      </w:r>
+    </w:p>
+    <w:p>
+      <w:pPr>
+        <w:numPr>
+          <w:ilvl w:val="0"/>
+          <w:numId w:val="38"/>
+        </w:numPr>
+        <w:spacing w:line="360" w:lineRule="auto"/>
+      </w:pPr>
+      <w:r>
+        <w:t>A set of use cases (with descriptions)</w:t>
+      </w:r>
+    </w:p>
+    <w:p>
+      <w:pPr>
+        <w:numPr>
+          <w:ilvl w:val="0"/>
+          <w:numId w:val="38"/>
+        </w:numPr>
+        <w:spacing w:line="360" w:lineRule="auto"/>
+      </w:pPr>
+      <w:r>
+        <w:t>A use case diagram</w:t>
+      </w:r>
+    </w:p>
+    <w:p>
+      <w:pPr>
+        <w:numPr>
+          <w:ilvl w:val="0"/>
+          <w:numId w:val="38"/>
+        </w:numPr>
+        <w:spacing w:line="360" w:lineRule="auto"/>
+      </w:pPr>
+      <w:r>
+        <w:t>An entity relationship diagram (ERD) or class diagram</w:t>
+      </w:r>
+    </w:p>
+    <w:p>
+      <w:pPr>
+        <w:numPr>
+          <w:ilvl w:val="0"/>
+          <w:numId w:val="38"/>
+        </w:numPr>
+        <w:spacing w:line="360" w:lineRule="auto"/>
+      </w:pPr>
+      <w:r>
+        <w:t>Any assumptions you have made during the design process</w:t>
+      </w:r>
+    </w:p>
+    <w:p/>
+    <w:p>
+      <w:pPr>
+        <w:rPr>
+          <w:b/>
+          <w:bCs/>
+        </w:rPr>
+      </w:pPr>
+      <w:r>
+        <w:rPr>
+          <w:b/>
+          <w:bCs/>
+        </w:rPr>
+        <w:t>Notes</w:t>
+      </w:r>
+    </w:p>
+    <w:p>
+      <w:pPr>
+        <w:numPr>
+          <w:ilvl w:val="0"/>
+          <w:numId w:val="39"/>
+        </w:numPr>
+        <w:spacing w:line="360" w:lineRule="auto"/>
+      </w:pPr>
+      <w:r>
+        <w:t>You are expected to make reasonable assumptions where details are missing</w:t>
+      </w:r>
+    </w:p>
+    <w:p>
+      <w:pPr>
+        <w:numPr>
+          <w:ilvl w:val="0"/>
+          <w:numId w:val="39"/>
+        </w:numPr>
+        <w:spacing w:line="360" w:lineRule="auto"/>
+      </w:pPr>
+      <w:r>
+        <w:t>There is no single correct answer; focus on clarity, completeness, and justification of your design</w:t>
+      </w:r>
+    </w:p>
+    <w:p>
+      <w:pPr>
+        <w:numPr>
+          <w:ilvl w:val="0"/>
+          <w:numId w:val="39"/>
+        </w:numPr>
+        <w:spacing w:line="360" w:lineRule="auto"/>
+      </w:pPr>
+      <w:r>
+        <w:t>Consider real-world behaviour and edge cases when modelling the system</w:t>
+      </w:r>
+    </w:p>
+    <w:p/>
     <w:p/>
     <w:sectPr>
       <w:pgSz w:w="11906" w:h="16838"/>
@@ -1444,6 +2022,155 @@
     </w:lvl>
   </w:abstractNum>
   <w:abstractNum w:abstractNumId="4" w15:restartNumberingAfterBreak="0">
+    <w:nsid w:val="16480D92"/>
+    <w:multiLevelType w:val="multilevel"/>
+    <w:tmpl w:val="A2841586"/>
+    <w:lvl w:ilvl="0">
+      <w:start w:val="1"/>
+      <w:numFmt w:val="bullet"/>
+      <w:lvlText w:val=""/>
+      <w:lvlJc w:val="left"/>
+      <w:pPr>
+        <w:tabs>
+          <w:tab w:val="num" w:pos="720"/>
+        </w:tabs>
+        <w:ind w:left="720" w:hanging="360"/>
+      </w:pPr>
+      <w:rPr>
+        <w:rFonts w:ascii="Symbol" w:hAnsi="Symbol" w:hint="default"/>
+        <w:sz w:val="20"/>
+      </w:rPr>
+    </w:lvl>
+    <w:lvl w:ilvl="1" w:tentative="1">
+      <w:start w:val="1"/>
+      <w:numFmt w:val="bullet"/>
+      <w:lvlText w:val="o"/>
+      <w:lvlJc w:val="left"/>
+      <w:pPr>
+        <w:tabs>
+          <w:tab w:val="num" w:pos="1440"/>
+        </w:tabs>
+        <w:ind w:left="1440" w:hanging="360"/>
+      </w:pPr>
+      <w:rPr>
+        <w:rFonts w:ascii="Courier New" w:hAnsi="Courier New" w:hint="default"/>
+        <w:sz w:val="20"/>
+      </w:rPr>
+    </w:lvl>
+    <w:lvl w:ilvl="2" w:tentative="1">
+      <w:start w:val="1"/>
+      <w:numFmt w:val="bullet"/>
+      <w:lvlText w:val=""/>
+      <w:lvlJc w:val="left"/>
+      <w:pPr>
+        <w:tabs>
+          <w:tab w:val="num" w:pos="2160"/>
+        </w:tabs>
+        <w:ind w:left="2160" w:hanging="360"/>
+      </w:pPr>
+      <w:rPr>
+        <w:rFonts w:ascii="Wingdings" w:hAnsi="Wingdings" w:hint="default"/>
+        <w:sz w:val="20"/>
+      </w:rPr>
+    </w:lvl>
+    <w:lvl w:ilvl="3" w:tentative="1">
+      <w:start w:val="1"/>
+      <w:numFmt w:val="bullet"/>
+      <w:lvlText w:val=""/>
+      <w:lvlJc w:val="left"/>
+      <w:pPr>
+        <w:tabs>
+          <w:tab w:val="num" w:pos="2880"/>
+        </w:tabs>
+        <w:ind w:left="2880" w:hanging="360"/>
+      </w:pPr>
+      <w:rPr>
+        <w:rFonts w:ascii="Wingdings" w:hAnsi="Wingdings" w:hint="default"/>
+        <w:sz w:val="20"/>
+      </w:rPr>
+    </w:lvl>
+    <w:lvl w:ilvl="4" w:tentative="1">
+      <w:start w:val="1"/>
+      <w:numFmt w:val="bullet"/>
+      <w:lvlText w:val=""/>
+      <w:lvlJc w:val="left"/>
+      <w:pPr>
+        <w:tabs>
+          <w:tab w:val="num" w:pos="3600"/>
+        </w:tabs>
+        <w:ind w:left="3600" w:hanging="360"/>
+      </w:pPr>
+      <w:rPr>
+        <w:rFonts w:ascii="Wingdings" w:hAnsi="Wingdings" w:hint="default"/>
+        <w:sz w:val="20"/>
+      </w:rPr>
+    </w:lvl>
+    <w:lvl w:ilvl="5" w:tentative="1">
+      <w:start w:val="1"/>
+      <w:numFmt w:val="bullet"/>
+      <w:lvlText w:val=""/>
+      <w:lvlJc w:val="left"/>
+      <w:pPr>
+        <w:tabs>
+          <w:tab w:val="num" w:pos="4320"/>
+        </w:tabs>
+        <w:ind w:left="4320" w:hanging="360"/>
+      </w:pPr>
+      <w:rPr>
+        <w:rFonts w:ascii="Wingdings" w:hAnsi="Wingdings" w:hint="default"/>
+        <w:sz w:val="20"/>
+      </w:rPr>
+    </w:lvl>
+    <w:lvl w:ilvl="6" w:tentative="1">
+      <w:start w:val="1"/>
+      <w:numFmt w:val="bullet"/>
+      <w:lvlText w:val=""/>
+      <w:lvlJc w:val="left"/>
+      <w:pPr>
+        <w:tabs>
+          <w:tab w:val="num" w:pos="5040"/>
+        </w:tabs>
+        <w:ind w:left="5040" w:hanging="360"/>
+      </w:pPr>
+      <w:rPr>
+        <w:rFonts w:ascii="Wingdings" w:hAnsi="Wingdings" w:hint="default"/>
+        <w:sz w:val="20"/>
+      </w:rPr>
+    </w:lvl>
+    <w:lvl w:ilvl="7" w:tentative="1">
+      <w:start w:val="1"/>
+      <w:numFmt w:val="bullet"/>
+      <w:lvlText w:val=""/>
+      <w:lvlJc w:val="left"/>
+      <w:pPr>
+        <w:tabs>
+          <w:tab w:val="num" w:pos="5760"/>
+        </w:tabs>
+        <w:ind w:left="5760" w:hanging="360"/>
+      </w:pPr>
+      <w:rPr>
+        <w:rFonts w:ascii="Wingdings" w:hAnsi="Wingdings" w:hint="default"/>
+        <w:sz w:val="20"/>
+      </w:rPr>
+    </w:lvl>
+    <w:lvl w:ilvl="8" w:tentative="1">
+      <w:start w:val="1"/>
+      <w:numFmt w:val="bullet"/>
+      <w:lvlText w:val=""/>
+      <w:lvlJc w:val="left"/>
+      <w:pPr>
+        <w:tabs>
+          <w:tab w:val="num" w:pos="6480"/>
+        </w:tabs>
+        <w:ind w:left="6480" w:hanging="360"/>
+      </w:pPr>
+      <w:rPr>
+        <w:rFonts w:ascii="Wingdings" w:hAnsi="Wingdings" w:hint="default"/>
+        <w:sz w:val="20"/>
+      </w:rPr>
+    </w:lvl>
+  </w:abstractNum>
+  <w:abstractNum w:abstractNumId="5" w15:restartNumberingAfterBreak="0">
     <w:nsid w:val="17695962"/>
     <w:multiLevelType w:val="multilevel"/>
     <w:tmpl w:val="750487C0"/>
@@ -1592,7 +2319,7 @@
       </w:rPr>
     </w:lvl>
   </w:abstractNum>
-  <w:abstractNum w:abstractNumId="5" w15:restartNumberingAfterBreak="0">
+  <w:abstractNum w:abstractNumId="6" w15:restartNumberingAfterBreak="0">
     <w:nsid w:val="18AC32D4"/>
     <w:multiLevelType w:val="multilevel"/>
     <w:tmpl w:val="43D0EFF0"/>
@@ -1741,7 +2468,156 @@
       </w:rPr>
     </w:lvl>
   </w:abstractNum>
-  <w:abstractNum w:abstractNumId="6" w15:restartNumberingAfterBreak="0">
+  <w:abstractNum w:abstractNumId="7" w15:restartNumberingAfterBreak="0">
+    <w:nsid w:val="19423940"/>
+    <w:multiLevelType w:val="multilevel"/>
+    <w:tmpl w:val="03C04EE8"/>
+    <w:lvl w:ilvl="0">
+      <w:start w:val="1"/>
+      <w:numFmt w:val="bullet"/>
+      <w:lvlText w:val=""/>
+      <w:lvlJc w:val="left"/>
+      <w:pPr>
+        <w:tabs>
+          <w:tab w:val="num" w:pos="720"/>
+        </w:tabs>
+        <w:ind w:left="720" w:hanging="360"/>
+      </w:pPr>
+      <w:rPr>
+        <w:rFonts w:ascii="Symbol" w:hAnsi="Symbol" w:hint="default"/>
+        <w:sz w:val="20"/>
+      </w:rPr>
+    </w:lvl>
+    <w:lvl w:ilvl="1" w:tentative="1">
+      <w:start w:val="1"/>
+      <w:numFmt w:val="bullet"/>
+      <w:lvlText w:val="o"/>
+      <w:lvlJc w:val="left"/>
+      <w:pPr>
+        <w:tabs>
+          <w:tab w:val="num" w:pos="1440"/>
+        </w:tabs>
+        <w:ind w:left="1440" w:hanging="360"/>
+      </w:pPr>
+      <w:rPr>
+        <w:rFonts w:ascii="Courier New" w:hAnsi="Courier New" w:hint="default"/>
+        <w:sz w:val="20"/>
+      </w:rPr>
+    </w:lvl>
+    <w:lvl w:ilvl="2" w:tentative="1">
+      <w:start w:val="1"/>
+      <w:numFmt w:val="bullet"/>
+      <w:lvlText w:val=""/>
+      <w:lvlJc w:val="left"/>
+      <w:pPr>
+        <w:tabs>
+          <w:tab w:val="num" w:pos="2160"/>
+        </w:tabs>
+        <w:ind w:left="2160" w:hanging="360"/>
+      </w:pPr>
+      <w:rPr>
+        <w:rFonts w:ascii="Wingdings" w:hAnsi="Wingdings" w:hint="default"/>
+        <w:sz w:val="20"/>
+      </w:rPr>
+    </w:lvl>
+    <w:lvl w:ilvl="3" w:tentative="1">
+      <w:start w:val="1"/>
+      <w:numFmt w:val="bullet"/>
+      <w:lvlText w:val=""/>
+      <w:lvlJc w:val="left"/>
+      <w:pPr>
+        <w:tabs>
+          <w:tab w:val="num" w:pos="2880"/>
+        </w:tabs>
+        <w:ind w:left="2880" w:hanging="360"/>
+      </w:pPr>
+      <w:rPr>
+        <w:rFonts w:ascii="Wingdings" w:hAnsi="Wingdings" w:hint="default"/>
+        <w:sz w:val="20"/>
+      </w:rPr>
+    </w:lvl>
+    <w:lvl w:ilvl="4" w:tentative="1">
+      <w:start w:val="1"/>
+      <w:numFmt w:val="bullet"/>
+      <w:lvlText w:val=""/>
+      <w:lvlJc w:val="left"/>
+      <w:pPr>
+        <w:tabs>
+          <w:tab w:val="num" w:pos="3600"/>
+        </w:tabs>
+        <w:ind w:left="3600" w:hanging="360"/>
+      </w:pPr>
+      <w:rPr>
+        <w:rFonts w:ascii="Wingdings" w:hAnsi="Wingdings" w:hint="default"/>
+        <w:sz w:val="20"/>
+      </w:rPr>
+    </w:lvl>
+    <w:lvl w:ilvl="5" w:tentative="1">
+      <w:start w:val="1"/>
+      <w:numFmt w:val="bullet"/>
+      <w:lvlText w:val=""/>
+      <w:lvlJc w:val="left"/>
+      <w:pPr>
+        <w:tabs>
+          <w:tab w:val="num" w:pos="4320"/>
+        </w:tabs>
+        <w:ind w:left="4320" w:hanging="360"/>
+      </w:pPr>
+      <w:rPr>
+        <w:rFonts w:ascii="Wingdings" w:hAnsi="Wingdings" w:hint="default"/>
+        <w:sz w:val="20"/>
+      </w:rPr>
+    </w:lvl>
+    <w:lvl w:ilvl="6" w:tentative="1">
+      <w:start w:val="1"/>
+      <w:numFmt w:val="bullet"/>
+      <w:lvlText w:val=""/>
+      <w:lvlJc w:val="left"/>
+      <w:pPr>
+        <w:tabs>
+          <w:tab w:val="num" w:pos="5040"/>
+        </w:tabs>
+        <w:ind w:left="5040" w:hanging="360"/>
+      </w:pPr>
+      <w:rPr>
+        <w:rFonts w:ascii="Wingdings" w:hAnsi="Wingdings" w:hint="default"/>
+        <w:sz w:val="20"/>
+      </w:rPr>
+    </w:lvl>
+    <w:lvl w:ilvl="7" w:tentative="1">
+      <w:start w:val="1"/>
+      <w:numFmt w:val="bullet"/>
+      <w:lvlText w:val=""/>
+      <w:lvlJc w:val="left"/>
+      <w:pPr>
+        <w:tabs>
+          <w:tab w:val="num" w:pos="5760"/>
+        </w:tabs>
+        <w:ind w:left="5760" w:hanging="360"/>
+      </w:pPr>
+      <w:rPr>
+        <w:rFonts w:ascii="Wingdings" w:hAnsi="Wingdings" w:hint="default"/>
+        <w:sz w:val="20"/>
+      </w:rPr>
+    </w:lvl>
+    <w:lvl w:ilvl="8" w:tentative="1">
+      <w:start w:val="1"/>
+      <w:numFmt w:val="bullet"/>
+      <w:lvlText w:val=""/>
+      <w:lvlJc w:val="left"/>
+      <w:pPr>
+        <w:tabs>
+          <w:tab w:val="num" w:pos="6480"/>
+        </w:tabs>
+        <w:ind w:left="6480" w:hanging="360"/>
+      </w:pPr>
+      <w:rPr>
+        <w:rFonts w:ascii="Wingdings" w:hAnsi="Wingdings" w:hint="default"/>
+        <w:sz w:val="20"/>
+      </w:rPr>
+    </w:lvl>
+  </w:abstractNum>
+  <w:abstractNum w:abstractNumId="8" w15:restartNumberingAfterBreak="0">
     <w:nsid w:val="1BCB63F4"/>
     <w:multiLevelType w:val="multilevel"/>
     <w:tmpl w:val="CDE42954"/>
@@ -1890,7 +2766,7 @@
       </w:rPr>
     </w:lvl>
   </w:abstractNum>
-  <w:abstractNum w:abstractNumId="7" w15:restartNumberingAfterBreak="0">
+  <w:abstractNum w:abstractNumId="9" w15:restartNumberingAfterBreak="0">
     <w:nsid w:val="1BFF454E"/>
     <w:multiLevelType w:val="multilevel"/>
     <w:tmpl w:val="20968DC4"/>
@@ -2039,7 +2915,7 @@
       </w:rPr>
     </w:lvl>
   </w:abstractNum>
-  <w:abstractNum w:abstractNumId="8" w15:restartNumberingAfterBreak="0">
+  <w:abstractNum w:abstractNumId="10" w15:restartNumberingAfterBreak="0">
     <w:nsid w:val="1CCA2AA9"/>
     <w:multiLevelType w:val="multilevel"/>
     <w:tmpl w:val="BA0AA624"/>
@@ -2188,7 +3064,156 @@
       </w:rPr>
     </w:lvl>
   </w:abstractNum>
-  <w:abstractNum w:abstractNumId="9" w15:restartNumberingAfterBreak="0">
+  <w:abstractNum w:abstractNumId="11" w15:restartNumberingAfterBreak="0">
+    <w:nsid w:val="1CD268C4"/>
+    <w:multiLevelType w:val="multilevel"/>
+    <w:tmpl w:val="C418760C"/>
+    <w:lvl w:ilvl="0">
+      <w:start w:val="1"/>
+      <w:numFmt w:val="bullet"/>
+      <w:lvlText w:val=""/>
+      <w:lvlJc w:val="left"/>
+      <w:pPr>
+        <w:tabs>
+          <w:tab w:val="num" w:pos="720"/>
+        </w:tabs>
+        <w:ind w:left="720" w:hanging="360"/>
+      </w:pPr>
+      <w:rPr>
+        <w:rFonts w:ascii="Symbol" w:hAnsi="Symbol" w:hint="default"/>
+        <w:sz w:val="20"/>
+      </w:rPr>
+    </w:lvl>
+    <w:lvl w:ilvl="1" w:tentative="1">
+      <w:start w:val="1"/>
+      <w:numFmt w:val="bullet"/>
+      <w:lvlText w:val="o"/>
+      <w:lvlJc w:val="left"/>
+      <w:pPr>
+        <w:tabs>
+          <w:tab w:val="num" w:pos="1440"/>
+        </w:tabs>
+        <w:ind w:left="1440" w:hanging="360"/>
+      </w:pPr>
+      <w:rPr>
+        <w:rFonts w:ascii="Courier New" w:hAnsi="Courier New" w:hint="default"/>
+        <w:sz w:val="20"/>
+      </w:rPr>
+    </w:lvl>
+    <w:lvl w:ilvl="2" w:tentative="1">
+      <w:start w:val="1"/>
+      <w:numFmt w:val="bullet"/>
+      <w:lvlText w:val=""/>
+      <w:lvlJc w:val="left"/>
+      <w:pPr>
+        <w:tabs>
+          <w:tab w:val="num" w:pos="2160"/>
+        </w:tabs>
+        <w:ind w:left="2160" w:hanging="360"/>
+      </w:pPr>
+      <w:rPr>
+        <w:rFonts w:ascii="Wingdings" w:hAnsi="Wingdings" w:hint="default"/>
+        <w:sz w:val="20"/>
+      </w:rPr>
+    </w:lvl>
+    <w:lvl w:ilvl="3" w:tentative="1">
+      <w:start w:val="1"/>
+      <w:numFmt w:val="bullet"/>
+      <w:lvlText w:val=""/>
+      <w:lvlJc w:val="left"/>
+      <w:pPr>
+        <w:tabs>
+          <w:tab w:val="num" w:pos="2880"/>
+        </w:tabs>
+        <w:ind w:left="2880" w:hanging="360"/>
+      </w:pPr>
+      <w:rPr>
+        <w:rFonts w:ascii="Wingdings" w:hAnsi="Wingdings" w:hint="default"/>
+        <w:sz w:val="20"/>
+      </w:rPr>
+    </w:lvl>
+    <w:lvl w:ilvl="4" w:tentative="1">
+      <w:start w:val="1"/>
+      <w:numFmt w:val="bullet"/>
+      <w:lvlText w:val=""/>
+      <w:lvlJc w:val="left"/>
+      <w:pPr>
+        <w:tabs>
+          <w:tab w:val="num" w:pos="3600"/>
+        </w:tabs>
+        <w:ind w:left="3600" w:hanging="360"/>
+      </w:pPr>
+      <w:rPr>
+        <w:rFonts w:ascii="Wingdings" w:hAnsi="Wingdings" w:hint="default"/>
+        <w:sz w:val="20"/>
+      </w:rPr>
+    </w:lvl>
+    <w:lvl w:ilvl="5" w:tentative="1">
+      <w:start w:val="1"/>
+      <w:numFmt w:val="bullet"/>
+      <w:lvlText w:val=""/>
+      <w:lvlJc w:val="left"/>
+      <w:pPr>
+        <w:tabs>
+          <w:tab w:val="num" w:pos="4320"/>
+        </w:tabs>
+        <w:ind w:left="4320" w:hanging="360"/>
+      </w:pPr>
+      <w:rPr>
+        <w:rFonts w:ascii="Wingdings" w:hAnsi="Wingdings" w:hint="default"/>
+        <w:sz w:val="20"/>
+      </w:rPr>
+    </w:lvl>
+    <w:lvl w:ilvl="6" w:tentative="1">
+      <w:start w:val="1"/>
+      <w:numFmt w:val="bullet"/>
+      <w:lvlText w:val=""/>
+      <w:lvlJc w:val="left"/>
+      <w:pPr>
+        <w:tabs>
+          <w:tab w:val="num" w:pos="5040"/>
+        </w:tabs>
+        <w:ind w:left="5040" w:hanging="360"/>
+      </w:pPr>
+      <w:rPr>
+        <w:rFonts w:ascii="Wingdings" w:hAnsi="Wingdings" w:hint="default"/>
+        <w:sz w:val="20"/>
+      </w:rPr>
+    </w:lvl>
+    <w:lvl w:ilvl="7" w:tentative="1">
+      <w:start w:val="1"/>
+      <w:numFmt w:val="bullet"/>
+      <w:lvlText w:val=""/>
+      <w:lvlJc w:val="left"/>
+      <w:pPr>
+        <w:tabs>
+          <w:tab w:val="num" w:pos="5760"/>
+        </w:tabs>
+        <w:ind w:left="5760" w:hanging="360"/>
+      </w:pPr>
+      <w:rPr>
+        <w:rFonts w:ascii="Wingdings" w:hAnsi="Wingdings" w:hint="default"/>
+        <w:sz w:val="20"/>
+      </w:rPr>
+    </w:lvl>
+    <w:lvl w:ilvl="8" w:tentative="1">
+      <w:start w:val="1"/>
+      <w:numFmt w:val="bullet"/>
+      <w:lvlText w:val=""/>
+      <w:lvlJc w:val="left"/>
+      <w:pPr>
+        <w:tabs>
+          <w:tab w:val="num" w:pos="6480"/>
+        </w:tabs>
+        <w:ind w:left="6480" w:hanging="360"/>
+      </w:pPr>
+      <w:rPr>
+        <w:rFonts w:ascii="Wingdings" w:hAnsi="Wingdings" w:hint="default"/>
+        <w:sz w:val="20"/>
+      </w:rPr>
+    </w:lvl>
+  </w:abstractNum>
+  <w:abstractNum w:abstractNumId="12" w15:restartNumberingAfterBreak="0">
     <w:nsid w:val="22846B24"/>
     <w:multiLevelType w:val="multilevel"/>
     <w:tmpl w:val="0C903942"/>
@@ -2337,7 +3362,156 @@
       </w:rPr>
     </w:lvl>
   </w:abstractNum>
-  <w:abstractNum w:abstractNumId="10" w15:restartNumberingAfterBreak="0">
+  <w:abstractNum w:abstractNumId="13" w15:restartNumberingAfterBreak="0">
+    <w:nsid w:val="22DB5E7B"/>
+    <w:multiLevelType w:val="multilevel"/>
+    <w:tmpl w:val="CDB2DE3C"/>
+    <w:lvl w:ilvl="0">
+      <w:start w:val="1"/>
+      <w:numFmt w:val="bullet"/>
+      <w:lvlText w:val=""/>
+      <w:lvlJc w:val="left"/>
+      <w:pPr>
+        <w:tabs>
+          <w:tab w:val="num" w:pos="720"/>
+        </w:tabs>
+        <w:ind w:left="720" w:hanging="360"/>
+      </w:pPr>
+      <w:rPr>
+        <w:rFonts w:ascii="Symbol" w:hAnsi="Symbol" w:hint="default"/>
+        <w:sz w:val="20"/>
+      </w:rPr>
+    </w:lvl>
+    <w:lvl w:ilvl="1" w:tentative="1">
+      <w:start w:val="1"/>
+      <w:numFmt w:val="bullet"/>
+      <w:lvlText w:val="o"/>
+      <w:lvlJc w:val="left"/>
+      <w:pPr>
+        <w:tabs>
+          <w:tab w:val="num" w:pos="1440"/>
+        </w:tabs>
+        <w:ind w:left="1440" w:hanging="360"/>
+      </w:pPr>
+      <w:rPr>
+        <w:rFonts w:ascii="Courier New" w:hAnsi="Courier New" w:hint="default"/>
+        <w:sz w:val="20"/>
+      </w:rPr>
+    </w:lvl>
+    <w:lvl w:ilvl="2" w:tentative="1">
+      <w:start w:val="1"/>
+      <w:numFmt w:val="bullet"/>
+      <w:lvlText w:val=""/>
+      <w:lvlJc w:val="left"/>
+      <w:pPr>
+        <w:tabs>
+          <w:tab w:val="num" w:pos="2160"/>
+        </w:tabs>
+        <w:ind w:left="2160" w:hanging="360"/>
+      </w:pPr>
+      <w:rPr>
+        <w:rFonts w:ascii="Wingdings" w:hAnsi="Wingdings" w:hint="default"/>
+        <w:sz w:val="20"/>
+      </w:rPr>
+    </w:lvl>
+    <w:lvl w:ilvl="3" w:tentative="1">
+      <w:start w:val="1"/>
+      <w:numFmt w:val="bullet"/>
+      <w:lvlText w:val=""/>
+      <w:lvlJc w:val="left"/>
+      <w:pPr>
+        <w:tabs>
+          <w:tab w:val="num" w:pos="2880"/>
+        </w:tabs>
+        <w:ind w:left="2880" w:hanging="360"/>
+      </w:pPr>
+      <w:rPr>
+        <w:rFonts w:ascii="Wingdings" w:hAnsi="Wingdings" w:hint="default"/>
+        <w:sz w:val="20"/>
+      </w:rPr>
+    </w:lvl>
+    <w:lvl w:ilvl="4" w:tentative="1">
+      <w:start w:val="1"/>
+      <w:numFmt w:val="bullet"/>
+      <w:lvlText w:val=""/>
+      <w:lvlJc w:val="left"/>
+      <w:pPr>
+        <w:tabs>
+          <w:tab w:val="num" w:pos="3600"/>
+        </w:tabs>
+        <w:ind w:left="3600" w:hanging="360"/>
+      </w:pPr>
+      <w:rPr>
+        <w:rFonts w:ascii="Wingdings" w:hAnsi="Wingdings" w:hint="default"/>
+        <w:sz w:val="20"/>
+      </w:rPr>
+    </w:lvl>
+    <w:lvl w:ilvl="5" w:tentative="1">
+      <w:start w:val="1"/>
+      <w:numFmt w:val="bullet"/>
+      <w:lvlText w:val=""/>
+      <w:lvlJc w:val="left"/>
+      <w:pPr>
+        <w:tabs>
+          <w:tab w:val="num" w:pos="4320"/>
+        </w:tabs>
+        <w:ind w:left="4320" w:hanging="360"/>
+      </w:pPr>
+      <w:rPr>
+        <w:rFonts w:ascii="Wingdings" w:hAnsi="Wingdings" w:hint="default"/>
+        <w:sz w:val="20"/>
+      </w:rPr>
+    </w:lvl>
+    <w:lvl w:ilvl="6" w:tentative="1">
+      <w:start w:val="1"/>
+      <w:numFmt w:val="bullet"/>
+      <w:lvlText w:val=""/>
+      <w:lvlJc w:val="left"/>
+      <w:pPr>
+        <w:tabs>
+          <w:tab w:val="num" w:pos="5040"/>
+        </w:tabs>
+        <w:ind w:left="5040" w:hanging="360"/>
+      </w:pPr>
+      <w:rPr>
+        <w:rFonts w:ascii="Wingdings" w:hAnsi="Wingdings" w:hint="default"/>
+        <w:sz w:val="20"/>
+      </w:rPr>
+    </w:lvl>
+    <w:lvl w:ilvl="7" w:tentative="1">
+      <w:start w:val="1"/>
+      <w:numFmt w:val="bullet"/>
+      <w:lvlText w:val=""/>
+      <w:lvlJc w:val="left"/>
+      <w:pPr>
+        <w:tabs>
+          <w:tab w:val="num" w:pos="5760"/>
+        </w:tabs>
+        <w:ind w:left="5760" w:hanging="360"/>
+      </w:pPr>
+      <w:rPr>
+        <w:rFonts w:ascii="Wingdings" w:hAnsi="Wingdings" w:hint="default"/>
+        <w:sz w:val="20"/>
+      </w:rPr>
+    </w:lvl>
+    <w:lvl w:ilvl="8" w:tentative="1">
+      <w:start w:val="1"/>
+      <w:numFmt w:val="bullet"/>
+      <w:lvlText w:val=""/>
+      <w:lvlJc w:val="left"/>
+      <w:pPr>
+        <w:tabs>
+          <w:tab w:val="num" w:pos="6480"/>
+        </w:tabs>
+        <w:ind w:left="6480" w:hanging="360"/>
+      </w:pPr>
+      <w:rPr>
+        <w:rFonts w:ascii="Wingdings" w:hAnsi="Wingdings" w:hint="default"/>
+        <w:sz w:val="20"/>
+      </w:rPr>
+    </w:lvl>
+  </w:abstractNum>
+  <w:abstractNum w:abstractNumId="14" w15:restartNumberingAfterBreak="0">
     <w:nsid w:val="263748A0"/>
     <w:multiLevelType w:val="multilevel"/>
     <w:tmpl w:val="B36CBA86"/>
@@ -2486,7 +3660,7 @@
       </w:rPr>
     </w:lvl>
   </w:abstractNum>
-  <w:abstractNum w:abstractNumId="11" w15:restartNumberingAfterBreak="0">
+  <w:abstractNum w:abstractNumId="15" w15:restartNumberingAfterBreak="0">
     <w:nsid w:val="27745534"/>
     <w:multiLevelType w:val="multilevel"/>
     <w:tmpl w:val="CF3E1368"/>
@@ -2635,7 +3809,7 @@
       </w:rPr>
     </w:lvl>
   </w:abstractNum>
-  <w:abstractNum w:abstractNumId="12" w15:restartNumberingAfterBreak="0">
+  <w:abstractNum w:abstractNumId="16" w15:restartNumberingAfterBreak="0">
     <w:nsid w:val="2AD14CFD"/>
     <w:multiLevelType w:val="multilevel"/>
     <w:tmpl w:val="ABC89386"/>
@@ -2784,7 +3958,156 @@
       </w:rPr>
     </w:lvl>
   </w:abstractNum>
-  <w:abstractNum w:abstractNumId="13" w15:restartNumberingAfterBreak="0">
+  <w:abstractNum w:abstractNumId="17" w15:restartNumberingAfterBreak="0">
+    <w:nsid w:val="2CBE383A"/>
+    <w:multiLevelType w:val="multilevel"/>
+    <w:tmpl w:val="B4106DBA"/>
+    <w:lvl w:ilvl="0">
+      <w:start w:val="1"/>
+      <w:numFmt w:val="bullet"/>
+      <w:lvlText w:val=""/>
+      <w:lvlJc w:val="left"/>
+      <w:pPr>
+        <w:tabs>
+          <w:tab w:val="num" w:pos="720"/>
+        </w:tabs>
+        <w:ind w:left="720" w:hanging="360"/>
+      </w:pPr>
+      <w:rPr>
+        <w:rFonts w:ascii="Symbol" w:hAnsi="Symbol" w:hint="default"/>
+        <w:sz w:val="20"/>
+      </w:rPr>
+    </w:lvl>
+    <w:lvl w:ilvl="1" w:tentative="1">
+      <w:start w:val="1"/>
+      <w:numFmt w:val="bullet"/>
+      <w:lvlText w:val="o"/>
+      <w:lvlJc w:val="left"/>
+      <w:pPr>
+        <w:tabs>
+          <w:tab w:val="num" w:pos="1440"/>
+        </w:tabs>
+        <w:ind w:left="1440" w:hanging="360"/>
+      </w:pPr>
+      <w:rPr>
+        <w:rFonts w:ascii="Courier New" w:hAnsi="Courier New" w:hint="default"/>
+        <w:sz w:val="20"/>
+      </w:rPr>
+    </w:lvl>
+    <w:lvl w:ilvl="2" w:tentative="1">
+      <w:start w:val="1"/>
+      <w:numFmt w:val="bullet"/>
+      <w:lvlText w:val=""/>
+      <w:lvlJc w:val="left"/>
+      <w:pPr>
+        <w:tabs>
+          <w:tab w:val="num" w:pos="2160"/>
+        </w:tabs>
+        <w:ind w:left="2160" w:hanging="360"/>
+      </w:pPr>
+      <w:rPr>
+        <w:rFonts w:ascii="Wingdings" w:hAnsi="Wingdings" w:hint="default"/>
+        <w:sz w:val="20"/>
+      </w:rPr>
+    </w:lvl>
+    <w:lvl w:ilvl="3" w:tentative="1">
+      <w:start w:val="1"/>
+      <w:numFmt w:val="bullet"/>
+      <w:lvlText w:val=""/>
+      <w:lvlJc w:val="left"/>
+      <w:pPr>
+        <w:tabs>
+          <w:tab w:val="num" w:pos="2880"/>
+        </w:tabs>
+        <w:ind w:left="2880" w:hanging="360"/>
+      </w:pPr>
+      <w:rPr>
+        <w:rFonts w:ascii="Wingdings" w:hAnsi="Wingdings" w:hint="default"/>
+        <w:sz w:val="20"/>
+      </w:rPr>
+    </w:lvl>
+    <w:lvl w:ilvl="4" w:tentative="1">
+      <w:start w:val="1"/>
+      <w:numFmt w:val="bullet"/>
+      <w:lvlText w:val=""/>
+      <w:lvlJc w:val="left"/>
+      <w:pPr>
+        <w:tabs>
+          <w:tab w:val="num" w:pos="3600"/>
+        </w:tabs>
+        <w:ind w:left="3600" w:hanging="360"/>
+      </w:pPr>
+      <w:rPr>
+        <w:rFonts w:ascii="Wingdings" w:hAnsi="Wingdings" w:hint="default"/>
+        <w:sz w:val="20"/>
+      </w:rPr>
+    </w:lvl>
+    <w:lvl w:ilvl="5" w:tentative="1">
+      <w:start w:val="1"/>
+      <w:numFmt w:val="bullet"/>
+      <w:lvlText w:val=""/>
+      <w:lvlJc w:val="left"/>
+      <w:pPr>
+        <w:tabs>
+          <w:tab w:val="num" w:pos="4320"/>
+        </w:tabs>
+        <w:ind w:left="4320" w:hanging="360"/>
+      </w:pPr>
+      <w:rPr>
+        <w:rFonts w:ascii="Wingdings" w:hAnsi="Wingdings" w:hint="default"/>
+        <w:sz w:val="20"/>
+      </w:rPr>
+    </w:lvl>
+    <w:lvl w:ilvl="6" w:tentative="1">
+      <w:start w:val="1"/>
+      <w:numFmt w:val="bullet"/>
+      <w:lvlText w:val=""/>
+      <w:lvlJc w:val="left"/>
+      <w:pPr>
+        <w:tabs>
+          <w:tab w:val="num" w:pos="5040"/>
+        </w:tabs>
+        <w:ind w:left="5040" w:hanging="360"/>
+      </w:pPr>
+      <w:rPr>
+        <w:rFonts w:ascii="Wingdings" w:hAnsi="Wingdings" w:hint="default"/>
+        <w:sz w:val="20"/>
+      </w:rPr>
+    </w:lvl>
+    <w:lvl w:ilvl="7" w:tentative="1">
+      <w:start w:val="1"/>
+      <w:numFmt w:val="bullet"/>
+      <w:lvlText w:val=""/>
+      <w:lvlJc w:val="left"/>
+      <w:pPr>
+        <w:tabs>
+          <w:tab w:val="num" w:pos="5760"/>
+        </w:tabs>
+        <w:ind w:left="5760" w:hanging="360"/>
+      </w:pPr>
+      <w:rPr>
+        <w:rFonts w:ascii="Wingdings" w:hAnsi="Wingdings" w:hint="default"/>
+        <w:sz w:val="20"/>
+      </w:rPr>
+    </w:lvl>
+    <w:lvl w:ilvl="8" w:tentative="1">
+      <w:start w:val="1"/>
+      <w:numFmt w:val="bullet"/>
+      <w:lvlText w:val=""/>
+      <w:lvlJc w:val="left"/>
+      <w:pPr>
+        <w:tabs>
+          <w:tab w:val="num" w:pos="6480"/>
+        </w:tabs>
+        <w:ind w:left="6480" w:hanging="360"/>
+      </w:pPr>
+      <w:rPr>
+        <w:rFonts w:ascii="Wingdings" w:hAnsi="Wingdings" w:hint="default"/>
+        <w:sz w:val="20"/>
+      </w:rPr>
+    </w:lvl>
+  </w:abstractNum>
+  <w:abstractNum w:abstractNumId="18" w15:restartNumberingAfterBreak="0">
     <w:nsid w:val="324F44E1"/>
     <w:multiLevelType w:val="multilevel"/>
     <w:tmpl w:val="433016EE"/>
@@ -2933,7 +4256,7 @@
       </w:rPr>
     </w:lvl>
   </w:abstractNum>
-  <w:abstractNum w:abstractNumId="14" w15:restartNumberingAfterBreak="0">
+  <w:abstractNum w:abstractNumId="19" w15:restartNumberingAfterBreak="0">
     <w:nsid w:val="38E90EE7"/>
     <w:multiLevelType w:val="multilevel"/>
     <w:tmpl w:val="C72A0B74"/>
@@ -3082,7 +4405,7 @@
       </w:rPr>
     </w:lvl>
   </w:abstractNum>
-  <w:abstractNum w:abstractNumId="15" w15:restartNumberingAfterBreak="0">
+  <w:abstractNum w:abstractNumId="20" w15:restartNumberingAfterBreak="0">
     <w:nsid w:val="390A7CD0"/>
     <w:multiLevelType w:val="multilevel"/>
     <w:tmpl w:val="2430C504"/>
@@ -3231,7 +4554,7 @@
       </w:rPr>
     </w:lvl>
   </w:abstractNum>
-  <w:abstractNum w:abstractNumId="16" w15:restartNumberingAfterBreak="0">
+  <w:abstractNum w:abstractNumId="21" w15:restartNumberingAfterBreak="0">
     <w:nsid w:val="39DD08B3"/>
     <w:multiLevelType w:val="multilevel"/>
     <w:tmpl w:val="D9F41F52"/>
@@ -3380,7 +4703,7 @@
       </w:rPr>
     </w:lvl>
   </w:abstractNum>
-  <w:abstractNum w:abstractNumId="17" w15:restartNumberingAfterBreak="0">
+  <w:abstractNum w:abstractNumId="22" w15:restartNumberingAfterBreak="0">
     <w:nsid w:val="3A2861F6"/>
     <w:multiLevelType w:val="multilevel"/>
     <w:tmpl w:val="C34A871E"/>
@@ -3529,7 +4852,7 @@
       </w:rPr>
     </w:lvl>
   </w:abstractNum>
-  <w:abstractNum w:abstractNumId="18" w15:restartNumberingAfterBreak="0">
+  <w:abstractNum w:abstractNumId="23" w15:restartNumberingAfterBreak="0">
     <w:nsid w:val="3B87647C"/>
     <w:multiLevelType w:val="multilevel"/>
     <w:tmpl w:val="7F3CC706"/>
@@ -3678,7 +5001,7 @@
       </w:rPr>
     </w:lvl>
   </w:abstractNum>
-  <w:abstractNum w:abstractNumId="19" w15:restartNumberingAfterBreak="0">
+  <w:abstractNum w:abstractNumId="24" w15:restartNumberingAfterBreak="0">
     <w:nsid w:val="3D872459"/>
     <w:multiLevelType w:val="multilevel"/>
     <w:tmpl w:val="37BEF96C"/>
@@ -3827,7 +5150,7 @@
       </w:rPr>
     </w:lvl>
   </w:abstractNum>
-  <w:abstractNum w:abstractNumId="20" w15:restartNumberingAfterBreak="0">
+  <w:abstractNum w:abstractNumId="25" w15:restartNumberingAfterBreak="0">
     <w:nsid w:val="3F973931"/>
     <w:multiLevelType w:val="multilevel"/>
     <w:tmpl w:val="846CAC24"/>
@@ -3976,7 +5299,7 @@
       </w:rPr>
     </w:lvl>
   </w:abstractNum>
-  <w:abstractNum w:abstractNumId="21" w15:restartNumberingAfterBreak="0">
+  <w:abstractNum w:abstractNumId="26" w15:restartNumberingAfterBreak="0">
     <w:nsid w:val="4118053F"/>
     <w:multiLevelType w:val="multilevel"/>
     <w:tmpl w:val="C51C433A"/>
@@ -4125,7 +5448,7 @@
       </w:rPr>
     </w:lvl>
   </w:abstractNum>
-  <w:abstractNum w:abstractNumId="22" w15:restartNumberingAfterBreak="0">
+  <w:abstractNum w:abstractNumId="27" w15:restartNumberingAfterBreak="0">
     <w:nsid w:val="419A7EE4"/>
     <w:multiLevelType w:val="multilevel"/>
     <w:tmpl w:val="98A0B2B4"/>
@@ -4274,7 +5597,156 @@
       </w:rPr>
     </w:lvl>
   </w:abstractNum>
-  <w:abstractNum w:abstractNumId="23" w15:restartNumberingAfterBreak="0">
+  <w:abstractNum w:abstractNumId="28" w15:restartNumberingAfterBreak="0">
+    <w:nsid w:val="41DA7781"/>
+    <w:multiLevelType w:val="multilevel"/>
+    <w:tmpl w:val="ADBEF17C"/>
+    <w:lvl w:ilvl="0">
+      <w:start w:val="1"/>
+      <w:numFmt w:val="bullet"/>
+      <w:lvlText w:val=""/>
+      <w:lvlJc w:val="left"/>
+      <w:pPr>
+        <w:tabs>
+          <w:tab w:val="num" w:pos="720"/>
+        </w:tabs>
+        <w:ind w:left="720" w:hanging="360"/>
+      </w:pPr>
+      <w:rPr>
+        <w:rFonts w:ascii="Symbol" w:hAnsi="Symbol" w:hint="default"/>
+        <w:sz w:val="20"/>
+      </w:rPr>
+    </w:lvl>
+    <w:lvl w:ilvl="1" w:tentative="1">
+      <w:start w:val="1"/>
+      <w:numFmt w:val="bullet"/>
+      <w:lvlText w:val="o"/>
+      <w:lvlJc w:val="left"/>
+      <w:pPr>
+        <w:tabs>
+          <w:tab w:val="num" w:pos="1440"/>
+        </w:tabs>
+        <w:ind w:left="1440" w:hanging="360"/>
+      </w:pPr>
+      <w:rPr>
+        <w:rFonts w:ascii="Courier New" w:hAnsi="Courier New" w:hint="default"/>
+        <w:sz w:val="20"/>
+      </w:rPr>
+    </w:lvl>
+    <w:lvl w:ilvl="2" w:tentative="1">
+      <w:start w:val="1"/>
+      <w:numFmt w:val="bullet"/>
+      <w:lvlText w:val=""/>
+      <w:lvlJc w:val="left"/>
+      <w:pPr>
+        <w:tabs>
+          <w:tab w:val="num" w:pos="2160"/>
+        </w:tabs>
+        <w:ind w:left="2160" w:hanging="360"/>
+      </w:pPr>
+      <w:rPr>
+        <w:rFonts w:ascii="Wingdings" w:hAnsi="Wingdings" w:hint="default"/>
+        <w:sz w:val="20"/>
+      </w:rPr>
+    </w:lvl>
+    <w:lvl w:ilvl="3" w:tentative="1">
+      <w:start w:val="1"/>
+      <w:numFmt w:val="bullet"/>
+      <w:lvlText w:val=""/>
+      <w:lvlJc w:val="left"/>
+      <w:pPr>
+        <w:tabs>
+          <w:tab w:val="num" w:pos="2880"/>
+        </w:tabs>
+        <w:ind w:left="2880" w:hanging="360"/>
+      </w:pPr>
+      <w:rPr>
+        <w:rFonts w:ascii="Wingdings" w:hAnsi="Wingdings" w:hint="default"/>
+        <w:sz w:val="20"/>
+      </w:rPr>
+    </w:lvl>
+    <w:lvl w:ilvl="4" w:tentative="1">
+      <w:start w:val="1"/>
+      <w:numFmt w:val="bullet"/>
+      <w:lvlText w:val=""/>
+      <w:lvlJc w:val="left"/>
+      <w:pPr>
+        <w:tabs>
+          <w:tab w:val="num" w:pos="3600"/>
+        </w:tabs>
+        <w:ind w:left="3600" w:hanging="360"/>
+      </w:pPr>
+      <w:rPr>
+        <w:rFonts w:ascii="Wingdings" w:hAnsi="Wingdings" w:hint="default"/>
+        <w:sz w:val="20"/>
+      </w:rPr>
+    </w:lvl>
+    <w:lvl w:ilvl="5" w:tentative="1">
+      <w:start w:val="1"/>
+      <w:numFmt w:val="bullet"/>
+      <w:lvlText w:val=""/>
+      <w:lvlJc w:val="left"/>
+      <w:pPr>
+        <w:tabs>
+          <w:tab w:val="num" w:pos="4320"/>
+        </w:tabs>
+        <w:ind w:left="4320" w:hanging="360"/>
+      </w:pPr>
+      <w:rPr>
+        <w:rFonts w:ascii="Wingdings" w:hAnsi="Wingdings" w:hint="default"/>
+        <w:sz w:val="20"/>
+      </w:rPr>
+    </w:lvl>
+    <w:lvl w:ilvl="6" w:tentative="1">
+      <w:start w:val="1"/>
+      <w:numFmt w:val="bullet"/>
+      <w:lvlText w:val=""/>
+      <w:lvlJc w:val="left"/>
+      <w:pPr>
+        <w:tabs>
+          <w:tab w:val="num" w:pos="5040"/>
+        </w:tabs>
+        <w:ind w:left="5040" w:hanging="360"/>
+      </w:pPr>
+      <w:rPr>
+        <w:rFonts w:ascii="Wingdings" w:hAnsi="Wingdings" w:hint="default"/>
+        <w:sz w:val="20"/>
+      </w:rPr>
+    </w:lvl>
+    <w:lvl w:ilvl="7" w:tentative="1">
+      <w:start w:val="1"/>
+      <w:numFmt w:val="bullet"/>
+      <w:lvlText w:val=""/>
+      <w:lvlJc w:val="left"/>
+      <w:pPr>
+        <w:tabs>
+          <w:tab w:val="num" w:pos="5760"/>
+        </w:tabs>
+        <w:ind w:left="5760" w:hanging="360"/>
+      </w:pPr>
+      <w:rPr>
+        <w:rFonts w:ascii="Wingdings" w:hAnsi="Wingdings" w:hint="default"/>
+        <w:sz w:val="20"/>
+      </w:rPr>
+    </w:lvl>
+    <w:lvl w:ilvl="8" w:tentative="1">
+      <w:start w:val="1"/>
+      <w:numFmt w:val="bullet"/>
+      <w:lvlText w:val=""/>
+      <w:lvlJc w:val="left"/>
+      <w:pPr>
+        <w:tabs>
+          <w:tab w:val="num" w:pos="6480"/>
+        </w:tabs>
+        <w:ind w:left="6480" w:hanging="360"/>
+      </w:pPr>
+      <w:rPr>
+        <w:rFonts w:ascii="Wingdings" w:hAnsi="Wingdings" w:hint="default"/>
+        <w:sz w:val="20"/>
+      </w:rPr>
+    </w:lvl>
+  </w:abstractNum>
+  <w:abstractNum w:abstractNumId="29" w15:restartNumberingAfterBreak="0">
     <w:nsid w:val="430C5ADD"/>
     <w:multiLevelType w:val="multilevel"/>
     <w:tmpl w:val="2F0E736C"/>
@@ -4423,7 +5895,7 @@
       </w:rPr>
     </w:lvl>
   </w:abstractNum>
-  <w:abstractNum w:abstractNumId="24" w15:restartNumberingAfterBreak="0">
+  <w:abstractNum w:abstractNumId="30" w15:restartNumberingAfterBreak="0">
     <w:nsid w:val="454E1683"/>
     <w:multiLevelType w:val="multilevel"/>
     <w:tmpl w:val="9156F9D8"/>
@@ -4536,7 +6008,156 @@
       </w:pPr>
     </w:lvl>
   </w:abstractNum>
-  <w:abstractNum w:abstractNumId="25" w15:restartNumberingAfterBreak="0">
+  <w:abstractNum w:abstractNumId="31" w15:restartNumberingAfterBreak="0">
+    <w:nsid w:val="463D5946"/>
+    <w:multiLevelType w:val="multilevel"/>
+    <w:tmpl w:val="3BD4A9E8"/>
+    <w:lvl w:ilvl="0">
+      <w:start w:val="1"/>
+      <w:numFmt w:val="bullet"/>
+      <w:lvlText w:val=""/>
+      <w:lvlJc w:val="left"/>
+      <w:pPr>
+        <w:tabs>
+          <w:tab w:val="num" w:pos="720"/>
+        </w:tabs>
+        <w:ind w:left="720" w:hanging="360"/>
+      </w:pPr>
+      <w:rPr>
+        <w:rFonts w:ascii="Symbol" w:hAnsi="Symbol" w:hint="default"/>
+        <w:sz w:val="20"/>
+      </w:rPr>
+    </w:lvl>
+    <w:lvl w:ilvl="1" w:tentative="1">
+      <w:start w:val="1"/>
+      <w:numFmt w:val="bullet"/>
+      <w:lvlText w:val="o"/>
+      <w:lvlJc w:val="left"/>
+      <w:pPr>
+        <w:tabs>
+          <w:tab w:val="num" w:pos="1440"/>
+        </w:tabs>
+        <w:ind w:left="1440" w:hanging="360"/>
+      </w:pPr>
+      <w:rPr>
+        <w:rFonts w:ascii="Courier New" w:hAnsi="Courier New" w:hint="default"/>
+        <w:sz w:val="20"/>
+      </w:rPr>
+    </w:lvl>
+    <w:lvl w:ilvl="2" w:tentative="1">
+      <w:start w:val="1"/>
+      <w:numFmt w:val="bullet"/>
+      <w:lvlText w:val=""/>
+      <w:lvlJc w:val="left"/>
+      <w:pPr>
+        <w:tabs>
+          <w:tab w:val="num" w:pos="2160"/>
+        </w:tabs>
+        <w:ind w:left="2160" w:hanging="360"/>
+      </w:pPr>
+      <w:rPr>
+        <w:rFonts w:ascii="Wingdings" w:hAnsi="Wingdings" w:hint="default"/>
+        <w:sz w:val="20"/>
+      </w:rPr>
+    </w:lvl>
+    <w:lvl w:ilvl="3" w:tentative="1">
+      <w:start w:val="1"/>
+      <w:numFmt w:val="bullet"/>
+      <w:lvlText w:val=""/>
+      <w:lvlJc w:val="left"/>
+      <w:pPr>
+        <w:tabs>
+          <w:tab w:val="num" w:pos="2880"/>
+        </w:tabs>
+        <w:ind w:left="2880" w:hanging="360"/>
+      </w:pPr>
+      <w:rPr>
+        <w:rFonts w:ascii="Wingdings" w:hAnsi="Wingdings" w:hint="default"/>
+        <w:sz w:val="20"/>
+      </w:rPr>
+    </w:lvl>
+    <w:lvl w:ilvl="4" w:tentative="1">
+      <w:start w:val="1"/>
+      <w:numFmt w:val="bullet"/>
+      <w:lvlText w:val=""/>
+      <w:lvlJc w:val="left"/>
+      <w:pPr>
+        <w:tabs>
+          <w:tab w:val="num" w:pos="3600"/>
+        </w:tabs>
+        <w:ind w:left="3600" w:hanging="360"/>
+      </w:pPr>
+      <w:rPr>
+        <w:rFonts w:ascii="Wingdings" w:hAnsi="Wingdings" w:hint="default"/>
+        <w:sz w:val="20"/>
+      </w:rPr>
+    </w:lvl>
+    <w:lvl w:ilvl="5" w:tentative="1">
+      <w:start w:val="1"/>
+      <w:numFmt w:val="bullet"/>
+      <w:lvlText w:val=""/>
+      <w:lvlJc w:val="left"/>
+      <w:pPr>
+        <w:tabs>
+          <w:tab w:val="num" w:pos="4320"/>
+        </w:tabs>
+        <w:ind w:left="4320" w:hanging="360"/>
+      </w:pPr>
+      <w:rPr>
+        <w:rFonts w:ascii="Wingdings" w:hAnsi="Wingdings" w:hint="default"/>
+        <w:sz w:val="20"/>
+      </w:rPr>
+    </w:lvl>
+    <w:lvl w:ilvl="6" w:tentative="1">
+      <w:start w:val="1"/>
+      <w:numFmt w:val="bullet"/>
+      <w:lvlText w:val=""/>
+      <w:lvlJc w:val="left"/>
+      <w:pPr>
+        <w:tabs>
+          <w:tab w:val="num" w:pos="5040"/>
+        </w:tabs>
+        <w:ind w:left="5040" w:hanging="360"/>
+      </w:pPr>
+      <w:rPr>
+        <w:rFonts w:ascii="Wingdings" w:hAnsi="Wingdings" w:hint="default"/>
+        <w:sz w:val="20"/>
+      </w:rPr>
+    </w:lvl>
+    <w:lvl w:ilvl="7" w:tentative="1">
+      <w:start w:val="1"/>
+      <w:numFmt w:val="bullet"/>
+      <w:lvlText w:val=""/>
+      <w:lvlJc w:val="left"/>
+      <w:pPr>
+        <w:tabs>
+          <w:tab w:val="num" w:pos="5760"/>
+        </w:tabs>
+        <w:ind w:left="5760" w:hanging="360"/>
+      </w:pPr>
+      <w:rPr>
+        <w:rFonts w:ascii="Wingdings" w:hAnsi="Wingdings" w:hint="default"/>
+        <w:sz w:val="20"/>
+      </w:rPr>
+    </w:lvl>
+    <w:lvl w:ilvl="8" w:tentative="1">
+      <w:start w:val="1"/>
+      <w:numFmt w:val="bullet"/>
+      <w:lvlText w:val=""/>
+      <w:lvlJc w:val="left"/>
+      <w:pPr>
+        <w:tabs>
+          <w:tab w:val="num" w:pos="6480"/>
+        </w:tabs>
+        <w:ind w:left="6480" w:hanging="360"/>
+      </w:pPr>
+      <w:rPr>
+        <w:rFonts w:ascii="Wingdings" w:hAnsi="Wingdings" w:hint="default"/>
+        <w:sz w:val="20"/>
+      </w:rPr>
+    </w:lvl>
+  </w:abstractNum>
+  <w:abstractNum w:abstractNumId="32" w15:restartNumberingAfterBreak="0">
     <w:nsid w:val="482B53AC"/>
     <w:multiLevelType w:val="multilevel"/>
     <w:tmpl w:val="623AE400"/>
@@ -4685,7 +6306,156 @@
       </w:rPr>
     </w:lvl>
   </w:abstractNum>
-  <w:abstractNum w:abstractNumId="26" w15:restartNumberingAfterBreak="0">
+  <w:abstractNum w:abstractNumId="33" w15:restartNumberingAfterBreak="0">
+    <w:nsid w:val="49476EA4"/>
+    <w:multiLevelType w:val="multilevel"/>
+    <w:tmpl w:val="A05EB12E"/>
+    <w:lvl w:ilvl="0">
+      <w:start w:val="1"/>
+      <w:numFmt w:val="bullet"/>
+      <w:lvlText w:val=""/>
+      <w:lvlJc w:val="left"/>
+      <w:pPr>
+        <w:tabs>
+          <w:tab w:val="num" w:pos="720"/>
+        </w:tabs>
+        <w:ind w:left="720" w:hanging="360"/>
+      </w:pPr>
+      <w:rPr>
+        <w:rFonts w:ascii="Symbol" w:hAnsi="Symbol" w:hint="default"/>
+        <w:sz w:val="20"/>
+      </w:rPr>
+    </w:lvl>
+    <w:lvl w:ilvl="1" w:tentative="1">
+      <w:start w:val="1"/>
+      <w:numFmt w:val="bullet"/>
+      <w:lvlText w:val="o"/>
+      <w:lvlJc w:val="left"/>
+      <w:pPr>
+        <w:tabs>
+          <w:tab w:val="num" w:pos="1440"/>
+        </w:tabs>
+        <w:ind w:left="1440" w:hanging="360"/>
+      </w:pPr>
+      <w:rPr>
+        <w:rFonts w:ascii="Courier New" w:hAnsi="Courier New" w:hint="default"/>
+        <w:sz w:val="20"/>
+      </w:rPr>
+    </w:lvl>
+    <w:lvl w:ilvl="2" w:tentative="1">
+      <w:start w:val="1"/>
+      <w:numFmt w:val="bullet"/>
+      <w:lvlText w:val=""/>
+      <w:lvlJc w:val="left"/>
+      <w:pPr>
+        <w:tabs>
+          <w:tab w:val="num" w:pos="2160"/>
+        </w:tabs>
+        <w:ind w:left="2160" w:hanging="360"/>
+      </w:pPr>
+      <w:rPr>
+        <w:rFonts w:ascii="Wingdings" w:hAnsi="Wingdings" w:hint="default"/>
+        <w:sz w:val="20"/>
+      </w:rPr>
+    </w:lvl>
+    <w:lvl w:ilvl="3" w:tentative="1">
+      <w:start w:val="1"/>
+      <w:numFmt w:val="bullet"/>
+      <w:lvlText w:val=""/>
+      <w:lvlJc w:val="left"/>
+      <w:pPr>
+        <w:tabs>
+          <w:tab w:val="num" w:pos="2880"/>
+        </w:tabs>
+        <w:ind w:left="2880" w:hanging="360"/>
+      </w:pPr>
+      <w:rPr>
+        <w:rFonts w:ascii="Wingdings" w:hAnsi="Wingdings" w:hint="default"/>
+        <w:sz w:val="20"/>
+      </w:rPr>
+    </w:lvl>
+    <w:lvl w:ilvl="4" w:tentative="1">
+      <w:start w:val="1"/>
+      <w:numFmt w:val="bullet"/>
+      <w:lvlText w:val=""/>
+      <w:lvlJc w:val="left"/>
+      <w:pPr>
+        <w:tabs>
+          <w:tab w:val="num" w:pos="3600"/>
+        </w:tabs>
+        <w:ind w:left="3600" w:hanging="360"/>
+      </w:pPr>
+      <w:rPr>
+        <w:rFonts w:ascii="Wingdings" w:hAnsi="Wingdings" w:hint="default"/>
+        <w:sz w:val="20"/>
+      </w:rPr>
+    </w:lvl>
+    <w:lvl w:ilvl="5" w:tentative="1">
+      <w:start w:val="1"/>
+      <w:numFmt w:val="bullet"/>
+      <w:lvlText w:val=""/>
+      <w:lvlJc w:val="left"/>
+      <w:pPr>
+        <w:tabs>
+          <w:tab w:val="num" w:pos="4320"/>
+        </w:tabs>
+        <w:ind w:left="4320" w:hanging="360"/>
+      </w:pPr>
+      <w:rPr>
+        <w:rFonts w:ascii="Wingdings" w:hAnsi="Wingdings" w:hint="default"/>
+        <w:sz w:val="20"/>
+      </w:rPr>
+    </w:lvl>
+    <w:lvl w:ilvl="6" w:tentative="1">
+      <w:start w:val="1"/>
+      <w:numFmt w:val="bullet"/>
+      <w:lvlText w:val=""/>
+      <w:lvlJc w:val="left"/>
+      <w:pPr>
+        <w:tabs>
+          <w:tab w:val="num" w:pos="5040"/>
+        </w:tabs>
+        <w:ind w:left="5040" w:hanging="360"/>
+      </w:pPr>
+      <w:rPr>
+        <w:rFonts w:ascii="Wingdings" w:hAnsi="Wingdings" w:hint="default"/>
+        <w:sz w:val="20"/>
+      </w:rPr>
+    </w:lvl>
+    <w:lvl w:ilvl="7" w:tentative="1">
+      <w:start w:val="1"/>
+      <w:numFmt w:val="bullet"/>
+      <w:lvlText w:val=""/>
+      <w:lvlJc w:val="left"/>
+      <w:pPr>
+        <w:tabs>
+          <w:tab w:val="num" w:pos="5760"/>
+        </w:tabs>
+        <w:ind w:left="5760" w:hanging="360"/>
+      </w:pPr>
+      <w:rPr>
+        <w:rFonts w:ascii="Wingdings" w:hAnsi="Wingdings" w:hint="default"/>
+        <w:sz w:val="20"/>
+      </w:rPr>
+    </w:lvl>
+    <w:lvl w:ilvl="8" w:tentative="1">
+      <w:start w:val="1"/>
+      <w:numFmt w:val="bullet"/>
+      <w:lvlText w:val=""/>
+      <w:lvlJc w:val="left"/>
+      <w:pPr>
+        <w:tabs>
+          <w:tab w:val="num" w:pos="6480"/>
+        </w:tabs>
+        <w:ind w:left="6480" w:hanging="360"/>
+      </w:pPr>
+      <w:rPr>
+        <w:rFonts w:ascii="Wingdings" w:hAnsi="Wingdings" w:hint="default"/>
+        <w:sz w:val="20"/>
+      </w:rPr>
+    </w:lvl>
+  </w:abstractNum>
+  <w:abstractNum w:abstractNumId="34" w15:restartNumberingAfterBreak="0">
     <w:nsid w:val="53AB0F91"/>
     <w:multiLevelType w:val="multilevel"/>
     <w:tmpl w:val="B0925D28"/>
@@ -4834,7 +6604,7 @@
       </w:rPr>
     </w:lvl>
   </w:abstractNum>
-  <w:abstractNum w:abstractNumId="27" w15:restartNumberingAfterBreak="0">
+  <w:abstractNum w:abstractNumId="35" w15:restartNumberingAfterBreak="0">
     <w:nsid w:val="597110B7"/>
     <w:multiLevelType w:val="multilevel"/>
     <w:tmpl w:val="B9D469F8"/>
@@ -4983,7 +6753,7 @@
       </w:rPr>
     </w:lvl>
   </w:abstractNum>
-  <w:abstractNum w:abstractNumId="28" w15:restartNumberingAfterBreak="0">
+  <w:abstractNum w:abstractNumId="36" w15:restartNumberingAfterBreak="0">
     <w:nsid w:val="5A4B357D"/>
     <w:multiLevelType w:val="multilevel"/>
     <w:tmpl w:val="52C6D08E"/>
@@ -5132,7 +6902,7 @@
       </w:rPr>
     </w:lvl>
   </w:abstractNum>
-  <w:abstractNum w:abstractNumId="29" w15:restartNumberingAfterBreak="0">
+  <w:abstractNum w:abstractNumId="37" w15:restartNumberingAfterBreak="0">
     <w:nsid w:val="65D036B1"/>
     <w:multiLevelType w:val="multilevel"/>
     <w:tmpl w:val="D0666794"/>
@@ -5281,7 +7051,7 @@
       </w:rPr>
     </w:lvl>
   </w:abstractNum>
-  <w:abstractNum w:abstractNumId="30" w15:restartNumberingAfterBreak="0">
+  <w:abstractNum w:abstractNumId="38" w15:restartNumberingAfterBreak="0">
     <w:nsid w:val="69FD59E0"/>
     <w:multiLevelType w:val="multilevel"/>
     <w:tmpl w:val="83225246"/>
@@ -5430,7 +7200,7 @@
       </w:rPr>
     </w:lvl>
   </w:abstractNum>
-  <w:abstractNum w:abstractNumId="31" w15:restartNumberingAfterBreak="0">
+  <w:abstractNum w:abstractNumId="39" w15:restartNumberingAfterBreak="0">
     <w:nsid w:val="79EC24BB"/>
     <w:multiLevelType w:val="multilevel"/>
     <w:tmpl w:val="B86ED69E"/>
@@ -5580,100 +7350,124 @@
     </w:lvl>
   </w:abstractNum>
   <w:num w:numId="1" w16cid:durableId="2139643140">
-    <w:abstractNumId w:val="31"/>
+    <w:abstractNumId w:val="39"/>
   </w:num>
   <w:num w:numId="2" w16cid:durableId="46224733">
-    <w:abstractNumId w:val="16"/>
+    <w:abstractNumId w:val="21"/>
   </w:num>
   <w:num w:numId="3" w16cid:durableId="2090997947">
-    <w:abstractNumId w:val="12"/>
+    <w:abstractNumId w:val="16"/>
   </w:num>
   <w:num w:numId="4" w16cid:durableId="976881581">
     <w:abstractNumId w:val="3"/>
   </w:num>
   <w:num w:numId="5" w16cid:durableId="880165142">
-    <w:abstractNumId w:val="4"/>
+    <w:abstractNumId w:val="5"/>
   </w:num>
   <w:num w:numId="6" w16cid:durableId="2008248065">
-    <w:abstractNumId w:val="13"/>
+    <w:abstractNumId w:val="18"/>
   </w:num>
   <w:num w:numId="7" w16cid:durableId="423457289">
-    <w:abstractNumId w:val="19"/>
+    <w:abstractNumId w:val="24"/>
   </w:num>
   <w:num w:numId="8" w16cid:durableId="2138133430">
     <w:abstractNumId w:val="1"/>
   </w:num>
   <w:num w:numId="9" w16cid:durableId="1814056985">
-    <w:abstractNumId w:val="15"/>
+    <w:abstractNumId w:val="20"/>
   </w:num>
   <w:num w:numId="10" w16cid:durableId="96801847">
-    <w:abstractNumId w:val="9"/>
+    <w:abstractNumId w:val="12"/>
   </w:num>
   <w:num w:numId="11" w16cid:durableId="654919841">
-    <w:abstractNumId w:val="22"/>
+    <w:abstractNumId w:val="27"/>
   </w:num>
   <w:num w:numId="12" w16cid:durableId="1145851422">
     <w:abstractNumId w:val="0"/>
   </w:num>
   <w:num w:numId="13" w16cid:durableId="1898933178">
-    <w:abstractNumId w:val="6"/>
+    <w:abstractNumId w:val="8"/>
   </w:num>
   <w:num w:numId="14" w16cid:durableId="121116889">
-    <w:abstractNumId w:val="7"/>
+    <w:abstractNumId w:val="9"/>
   </w:num>
   <w:num w:numId="15" w16cid:durableId="402341363">
+    <w:abstractNumId w:val="37"/>
+  </w:num>
+  <w:num w:numId="16" w16cid:durableId="644895940">
+    <w:abstractNumId w:val="36"/>
+  </w:num>
+  <w:num w:numId="17" w16cid:durableId="1957327728">
+    <w:abstractNumId w:val="22"/>
+  </w:num>
+  <w:num w:numId="18" w16cid:durableId="231086582">
+    <w:abstractNumId w:val="10"/>
+  </w:num>
+  <w:num w:numId="19" w16cid:durableId="1413311223">
+    <w:abstractNumId w:val="23"/>
+  </w:num>
+  <w:num w:numId="20" w16cid:durableId="1282570143">
     <w:abstractNumId w:val="29"/>
   </w:num>
-  <w:num w:numId="16" w16cid:durableId="644895940">
-    <w:abstractNumId w:val="28"/>
-  </w:num>
-  <w:num w:numId="17" w16cid:durableId="1957327728">
-    <w:abstractNumId w:val="17"/>
-  </w:num>
-  <w:num w:numId="18" w16cid:durableId="231086582">
-    <w:abstractNumId w:val="8"/>
-  </w:num>
-  <w:num w:numId="19" w16cid:durableId="1413311223">
-    <w:abstractNumId w:val="18"/>
-  </w:num>
-  <w:num w:numId="20" w16cid:durableId="1282570143">
-    <w:abstractNumId w:val="23"/>
-  </w:num>
   <w:num w:numId="21" w16cid:durableId="407120505">
-    <w:abstractNumId w:val="26"/>
+    <w:abstractNumId w:val="34"/>
   </w:num>
   <w:num w:numId="22" w16cid:durableId="213539893">
     <w:abstractNumId w:val="2"/>
   </w:num>
   <w:num w:numId="23" w16cid:durableId="1423916096">
+    <w:abstractNumId w:val="19"/>
+  </w:num>
+  <w:num w:numId="24" w16cid:durableId="1601180284">
+    <w:abstractNumId w:val="15"/>
+  </w:num>
+  <w:num w:numId="25" w16cid:durableId="969749654">
+    <w:abstractNumId w:val="32"/>
+  </w:num>
+  <w:num w:numId="26" w16cid:durableId="562522170">
     <w:abstractNumId w:val="14"/>
   </w:num>
-  <w:num w:numId="24" w16cid:durableId="1601180284">
+  <w:num w:numId="27" w16cid:durableId="1064917006">
+    <w:abstractNumId w:val="30"/>
+  </w:num>
+  <w:num w:numId="28" w16cid:durableId="1501390292">
+    <w:abstractNumId w:val="38"/>
+  </w:num>
+  <w:num w:numId="29" w16cid:durableId="983579002">
+    <w:abstractNumId w:val="26"/>
+  </w:num>
+  <w:num w:numId="30" w16cid:durableId="666597374">
+    <w:abstractNumId w:val="25"/>
+  </w:num>
+  <w:num w:numId="31" w16cid:durableId="803619889">
+    <w:abstractNumId w:val="6"/>
+  </w:num>
+  <w:num w:numId="32" w16cid:durableId="1609506982">
+    <w:abstractNumId w:val="35"/>
+  </w:num>
+  <w:num w:numId="33" w16cid:durableId="1644383597">
+    <w:abstractNumId w:val="31"/>
+  </w:num>
+  <w:num w:numId="34" w16cid:durableId="524051790">
+    <w:abstractNumId w:val="4"/>
+  </w:num>
+  <w:num w:numId="35" w16cid:durableId="877281866">
+    <w:abstractNumId w:val="13"/>
+  </w:num>
+  <w:num w:numId="36" w16cid:durableId="1571887949">
+    <w:abstractNumId w:val="33"/>
+  </w:num>
+  <w:num w:numId="37" w16cid:durableId="552621903">
     <w:abstractNumId w:val="11"/>
   </w:num>
-  <w:num w:numId="25" w16cid:durableId="969749654">
-    <w:abstractNumId w:val="25"/>
+  <w:num w:numId="38" w16cid:durableId="1378050609">
+    <w:abstractNumId w:val="28"/>
   </w:num>
-  <w:num w:numId="26" w16cid:durableId="562522170">
-    <w:abstractNumId w:val="10"/>
+  <w:num w:numId="39" w16cid:durableId="2144886203">
+    <w:abstractNumId w:val="17"/>
   </w:num>
-  <w:num w:numId="27" w16cid:durableId="1064917006">
-    <w:abstractNumId w:val="24"/>
-  </w:num>
-  <w:num w:numId="28" w16cid:durableId="1501390292">
-    <w:abstractNumId w:val="30"/>
-  </w:num>
-  <w:num w:numId="29" w16cid:durableId="983579002">
-    <w:abstractNumId w:val="21"/>
-  </w:num>
-  <w:num w:numId="30" w16cid:durableId="666597374">
-    <w:abstractNumId w:val="20"/>
-  </w:num>
-  <w:num w:numId="31" w16cid:durableId="803619889">
-    <w:abstractNumId w:val="5"/>
-  </w:num>
-  <w:num w:numId="32" w16cid:durableId="1609506982">
-    <w:abstractNumId w:val="27"/>
+  <w:num w:numId="40" w16cid:durableId="1199270887">
+    <w:abstractNumId w:val="7"/>
   </w:num>
 </w:numbering>
 </file>
@@ -6129,7 +7923,6 @@
     <w:next w:val="Normal"/>
     <w:link w:val="Heading3Char"/>
     <w:uiPriority w:val="9"/>
-    <w:semiHidden/>
     <w:unhideWhenUsed/>
     <w:qFormat/>
     <w:rsid w:val="005D2D86"/>
@@ -6279,7 +8072,6 @@
   <w:style w:type="character" w:default="1" w:styleId="DefaultParagraphFont">
     <w:name w:val="Default Paragraph Font"/>
     <w:uiPriority w:val="1"/>
-    <w:semiHidden/>
     <w:unhideWhenUsed/>
   </w:style>
   <w:style w:type="table" w:default="1" w:styleId="TableNormal">
@@ -6350,7 +8142,6 @@
     <w:basedOn w:val="DefaultParagraphFont"/>
     <w:link w:val="Heading3"/>
     <w:uiPriority w:val="9"/>
-    <w:semiHidden/>
     <w:rsid w:val="005D2D86"/>
     <w:rPr>
       <w:rFonts w:asciiTheme="minorHAnsi" w:eastAsiaTheme="majorEastAsia" w:hAnsiTheme="minorHAnsi" w:cstheme="majorBidi"/>
@@ -6624,6 +8415,22 @@
       <w:color w:val="0F4761" w:themeColor="accent1" w:themeShade="BF"/>
       <w:spacing w:val="5"/>
     </w:rPr>
+  </w:style>
+  <w:style w:type="table" w:styleId="TableGridLight">
+    <w:name w:val="Grid Table Light"/>
+    <w:basedOn w:val="TableNormal"/>
+    <w:uiPriority w:val="40"/>
+    <w:rsid w:val="007E11AE"/>
+    <w:tblPr>
+      <w:tblBorders>
+        <w:top w:val="single" w:sz="4" w:space="0" w:color="BFBFBF" w:themeColor="background1" w:themeShade="BF"/>
+        <w:left w:val="single" w:sz="4" w:space="0" w:color="BFBFBF" w:themeColor="background1" w:themeShade="BF"/>
+        <w:bottom w:val="single" w:sz="4" w:space="0" w:color="BFBFBF" w:themeColor="background1" w:themeShade="BF"/>
+        <w:right w:val="single" w:sz="4" w:space="0" w:color="BFBFBF" w:themeColor="background1" w:themeShade="BF"/>
+        <w:insideH w:val="single" w:sz="4" w:space="0" w:color="BFBFBF" w:themeColor="background1" w:themeShade="BF"/>
+        <w:insideV w:val="single" w:sz="4" w:space="0" w:color="BFBFBF" w:themeColor="background1" w:themeShade="BF"/>
+      </w:tblBorders>
+    </w:tblPr>
   </w:style>
 </w:styles>
 </file>

</xml_diff>